<commit_message>
redesign Projects page, center things some more, update resume
</commit_message>
<xml_diff>
--- a/public/resume.docx
+++ b/public/resume.docx
@@ -45,12 +45,12 @@
             <wp:inline distB="114300" distT="114300" distL="114300" distR="114300">
               <wp:extent cx="224014" cy="190500"/>
               <wp:effectExtent b="0" l="0" r="0" t="0"/>
-              <wp:docPr id="2" name="image2.png"/>
+              <wp:docPr id="2" name="image1.png"/>
               <a:graphic>
                 <a:graphicData uri="http://schemas.openxmlformats.org/drawingml/2006/picture">
                   <pic:pic>
                     <pic:nvPicPr>
-                      <pic:cNvPr id="0" name="image2.png"/>
+                      <pic:cNvPr id="0" name="image1.png"/>
                       <pic:cNvPicPr preferRelativeResize="0"/>
                     </pic:nvPicPr>
                     <pic:blipFill>
@@ -147,20 +147,13 @@
       </w:hyperlink>
       <w:r>
         <w:rPr>
-          <w:rtl w:val="0"/>
-        </w:rPr>
-      </w:r>
-    </w:p>
-    <w:p>
-      <w:pPr>
-        <w:widowControl w:val="0"/>
-        <w:jc w:val="center"/>
-        <w:rPr>
-          <w:rFonts w:ascii="Times New Roman" w:cs="Times New Roman" w:eastAsia="Times New Roman" w:hAnsi="Times New Roman"/>
-          <w:sz w:val="20"/>
-          <w:szCs w:val="20"/>
-        </w:rPr>
-      </w:pPr>
+          <w:rFonts w:ascii="Times New Roman" w:cs="Times New Roman" w:eastAsia="Times New Roman" w:hAnsi="Times New Roman"/>
+          <w:sz w:val="20"/>
+          <w:szCs w:val="20"/>
+          <w:rtl w:val="0"/>
+        </w:rPr>
+        <w:t xml:space="preserve"> </w:t>
+      </w:r>
       <w:r>
         <w:pict>
           <v:rect style="width:0.0pt;height:1.5pt" o:hr="t" o:hrstd="t" o:hralign="center" fillcolor="#A0A0A0" stroked="f"/>
@@ -221,7 +214,7 @@
           <w:szCs w:val="20"/>
           <w:rtl w:val="0"/>
         </w:rPr>
-        <w:t xml:space="preserve">  • I am seeking a mid-level software engineering role in product development</w:t>
+        <w:t xml:space="preserve">  • I am seeking a software engineering role in product development</w:t>
       </w:r>
     </w:p>
     <w:p>
@@ -259,7 +252,7 @@
           <w:szCs w:val="20"/>
           <w:rtl w:val="0"/>
         </w:rPr>
-        <w:t xml:space="preserve">  • With a CS degree and about two years’ experience, I enjoy solving technical problems anywhere on the stack</w:t>
+        <w:t xml:space="preserve">  • With a CS degree and about 2 years’ experience, I enjoy solving technical problems anywhere on the stack</w:t>
       </w:r>
     </w:p>
     <w:p>
@@ -348,7 +341,7 @@
           <w:szCs w:val="20"/>
           <w:rtl w:val="0"/>
         </w:rPr>
-        <w:t xml:space="preserve">Algorithms &amp; Data Structures    –   OOP   –   FP    –   JavaScript (Express, React {Native}, Redux, Node.js)   –   Arch Linux</w:t>
+        <w:t xml:space="preserve">Algorithms &amp; Data Structures – OOP – FP – SOLID – JavaScript (Express, React {Native}, Node.js) – HTML &amp; CSS – Arch Linux</w:t>
       </w:r>
     </w:p>
     <w:p>
@@ -368,7 +361,7 @@
           <w:szCs w:val="20"/>
           <w:rtl w:val="0"/>
         </w:rPr>
-        <w:t xml:space="preserve">Python {2,3}     –     Swift 4     –     TypeScript     –     Golang    –     BASH     –     Docker    –     Mongo     –     SQL     –     Angular</w:t>
+        <w:t xml:space="preserve">TypeScript  –  Python 3   –  Swift 4   –  Golang   –  BASH   –  Docker   –  Mongo   –  SQL (basics)  –  Java  –  System Design (basics)</w:t>
       </w:r>
     </w:p>
     <w:p>
@@ -477,6 +470,194 @@
           <w:szCs w:val="20"/>
           <w:rtl w:val="0"/>
         </w:rPr>
+        <w:t xml:space="preserve">Freelance Software Engineer, Computer Science/Programming Tutor</w:t>
+      </w:r>
+      <w:r>
+        <w:rPr>
+          <w:rFonts w:ascii="Times New Roman" w:cs="Times New Roman" w:eastAsia="Times New Roman" w:hAnsi="Times New Roman"/>
+          <w:sz w:val="20"/>
+          <w:szCs w:val="20"/>
+          <w:rtl w:val="0"/>
+        </w:rPr>
+        <w:t xml:space="preserve"> (</w:t>
+      </w:r>
+      <w:hyperlink r:id="rId10">
+        <w:r>
+          <w:rPr>
+            <w:rFonts w:ascii="Times New Roman" w:cs="Times New Roman" w:eastAsia="Times New Roman" w:hAnsi="Times New Roman"/>
+            <w:color w:val="1155cc"/>
+            <w:sz w:val="20"/>
+            <w:szCs w:val="20"/>
+            <w:u w:val="single"/>
+            <w:rtl w:val="0"/>
+          </w:rPr>
+          <w:t xml:space="preserve">find me on Wyzant!</w:t>
+        </w:r>
+      </w:hyperlink>
+      <w:r>
+        <w:rPr>
+          <w:rFonts w:ascii="Times New Roman" w:cs="Times New Roman" w:eastAsia="Times New Roman" w:hAnsi="Times New Roman"/>
+          <w:sz w:val="20"/>
+          <w:szCs w:val="20"/>
+          <w:rtl w:val="0"/>
+        </w:rPr>
+        <w:t xml:space="preserve">)                          March 2020 – Present</w:t>
+      </w:r>
+    </w:p>
+    <w:p>
+      <w:pPr>
+        <w:widowControl w:val="0"/>
+        <w:rPr>
+          <w:rFonts w:ascii="Times New Roman" w:cs="Times New Roman" w:eastAsia="Times New Roman" w:hAnsi="Times New Roman"/>
+          <w:i w:val="1"/>
+          <w:sz w:val="20"/>
+          <w:szCs w:val="20"/>
+        </w:rPr>
+      </w:pPr>
+      <w:r>
+        <w:rPr>
+          <w:rFonts w:ascii="Times New Roman" w:cs="Times New Roman" w:eastAsia="Times New Roman" w:hAnsi="Times New Roman"/>
+          <w:i w:val="1"/>
+          <w:sz w:val="20"/>
+          <w:szCs w:val="20"/>
+          <w:rtl w:val="0"/>
+        </w:rPr>
+        <w:t xml:space="preserve">Santa Monica, CA (remote/online)</w:t>
+      </w:r>
+    </w:p>
+    <w:p>
+      <w:pPr>
+        <w:widowControl w:val="0"/>
+        <w:numPr>
+          <w:ilvl w:val="0"/>
+          <w:numId w:val="2"/>
+        </w:numPr>
+        <w:ind w:left="720" w:hanging="360"/>
+        <w:rPr>
+          <w:rFonts w:ascii="Times New Roman" w:cs="Times New Roman" w:eastAsia="Times New Roman" w:hAnsi="Times New Roman"/>
+          <w:sz w:val="20"/>
+          <w:szCs w:val="20"/>
+          <w:u w:val="none"/>
+        </w:rPr>
+      </w:pPr>
+      <w:r>
+        <w:rPr>
+          <w:rFonts w:ascii="Times New Roman" w:cs="Times New Roman" w:eastAsia="Times New Roman" w:hAnsi="Times New Roman"/>
+          <w:sz w:val="20"/>
+          <w:szCs w:val="20"/>
+          <w:rtl w:val="0"/>
+        </w:rPr>
+        <w:t xml:space="preserve">Configured and implemented Dockerized LDAP user/group management, along with Token-auth in a Python 3 Flask API</w:t>
+      </w:r>
+    </w:p>
+    <w:p>
+      <w:pPr>
+        <w:widowControl w:val="0"/>
+        <w:numPr>
+          <w:ilvl w:val="0"/>
+          <w:numId w:val="2"/>
+        </w:numPr>
+        <w:ind w:left="720" w:hanging="360"/>
+        <w:rPr>
+          <w:rFonts w:ascii="Times New Roman" w:cs="Times New Roman" w:eastAsia="Times New Roman" w:hAnsi="Times New Roman"/>
+          <w:sz w:val="20"/>
+          <w:szCs w:val="20"/>
+          <w:u w:val="none"/>
+        </w:rPr>
+      </w:pPr>
+      <w:r>
+        <w:rPr>
+          <w:rFonts w:ascii="Times New Roman" w:cs="Times New Roman" w:eastAsia="Times New Roman" w:hAnsi="Times New Roman"/>
+          <w:sz w:val="20"/>
+          <w:szCs w:val="20"/>
+          <w:rtl w:val="0"/>
+        </w:rPr>
+        <w:t xml:space="preserve">Designed and implemented a game tree applied to a tic-tac-toe game by generalizing a minimax algorithm in C++17</w:t>
+      </w:r>
+    </w:p>
+    <w:p>
+      <w:pPr>
+        <w:widowControl w:val="0"/>
+        <w:numPr>
+          <w:ilvl w:val="0"/>
+          <w:numId w:val="2"/>
+        </w:numPr>
+        <w:ind w:left="720" w:hanging="360"/>
+        <w:rPr>
+          <w:rFonts w:ascii="Times New Roman" w:cs="Times New Roman" w:eastAsia="Times New Roman" w:hAnsi="Times New Roman"/>
+          <w:sz w:val="20"/>
+          <w:szCs w:val="20"/>
+          <w:u w:val="none"/>
+        </w:rPr>
+      </w:pPr>
+      <w:r>
+        <w:rPr>
+          <w:rFonts w:ascii="Times New Roman" w:cs="Times New Roman" w:eastAsia="Times New Roman" w:hAnsi="Times New Roman"/>
+          <w:sz w:val="20"/>
+          <w:szCs w:val="20"/>
+          <w:rtl w:val="0"/>
+        </w:rPr>
+        <w:t xml:space="preserve">Created Ethereum smart contracts using Solidity, and defensively tested contracts</w:t>
+      </w:r>
+    </w:p>
+    <w:p>
+      <w:pPr>
+        <w:widowControl w:val="0"/>
+        <w:numPr>
+          <w:ilvl w:val="0"/>
+          <w:numId w:val="2"/>
+        </w:numPr>
+        <w:ind w:left="720" w:hanging="360"/>
+        <w:rPr>
+          <w:rFonts w:ascii="Times New Roman" w:cs="Times New Roman" w:eastAsia="Times New Roman" w:hAnsi="Times New Roman"/>
+          <w:sz w:val="20"/>
+          <w:szCs w:val="20"/>
+          <w:u w:val="none"/>
+        </w:rPr>
+      </w:pPr>
+      <w:r>
+        <w:rPr>
+          <w:rFonts w:ascii="Times New Roman" w:cs="Times New Roman" w:eastAsia="Times New Roman" w:hAnsi="Times New Roman"/>
+          <w:sz w:val="20"/>
+          <w:szCs w:val="20"/>
+          <w:rtl w:val="0"/>
+        </w:rPr>
+        <w:t xml:space="preserve">Tutor algorithms (I help students to: break problems into smaller pieces, write edge cases, iteratively improve a solution)</w:t>
+      </w:r>
+    </w:p>
+    <w:p>
+      <w:pPr>
+        <w:widowControl w:val="0"/>
+        <w:ind w:left="0" w:firstLine="0"/>
+        <w:rPr>
+          <w:rFonts w:ascii="Times New Roman" w:cs="Times New Roman" w:eastAsia="Times New Roman" w:hAnsi="Times New Roman"/>
+          <w:sz w:val="8"/>
+          <w:szCs w:val="8"/>
+        </w:rPr>
+      </w:pPr>
+      <w:r>
+        <w:rPr>
+          <w:rtl w:val="0"/>
+        </w:rPr>
+      </w:r>
+    </w:p>
+    <w:p>
+      <w:pPr>
+        <w:widowControl w:val="0"/>
+        <w:rPr>
+          <w:rFonts w:ascii="Times New Roman" w:cs="Times New Roman" w:eastAsia="Times New Roman" w:hAnsi="Times New Roman"/>
+          <w:sz w:val="20"/>
+          <w:szCs w:val="20"/>
+        </w:rPr>
+      </w:pPr>
+      <w:r>
+        <w:rPr>
+          <w:rFonts w:ascii="Times New Roman" w:cs="Times New Roman" w:eastAsia="Times New Roman" w:hAnsi="Times New Roman"/>
+          <w:b w:val="1"/>
+          <w:sz w:val="20"/>
+          <w:szCs w:val="20"/>
+          <w:rtl w:val="0"/>
+        </w:rPr>
         <w:t xml:space="preserve">Engineer, Oracle</w:t>
       </w:r>
       <w:r>
@@ -486,7 +667,7 @@
           <w:szCs w:val="20"/>
           <w:rtl w:val="0"/>
         </w:rPr>
-        <w:t xml:space="preserve">                                                                                                                                                           July 2018 – Present</w:t>
+        <w:t xml:space="preserve">                                                                                                                                                 July 2018 – January 2020</w:t>
       </w:r>
       <w:r>
         <w:rPr>
@@ -522,7 +703,7 @@
         </w:rPr>
         <w:t xml:space="preserve"> – </w:t>
       </w:r>
-      <w:hyperlink r:id="rId10">
+      <w:hyperlink r:id="rId11">
         <w:r>
           <w:rPr>
             <w:rFonts w:ascii="Times New Roman" w:cs="Times New Roman" w:eastAsia="Times New Roman" w:hAnsi="Times New Roman"/>
@@ -546,7 +727,7 @@
         <w:widowControl w:val="0"/>
         <w:numPr>
           <w:ilvl w:val="0"/>
-          <w:numId w:val="2"/>
+          <w:numId w:val="3"/>
         </w:numPr>
         <w:ind w:left="720" w:hanging="360"/>
         <w:rPr>
@@ -562,7 +743,7 @@
           <w:szCs w:val="20"/>
           <w:rtl w:val="0"/>
         </w:rPr>
-        <w:t xml:space="preserve">Build proof-of-concept (POC) apps to demonstrate how cloud offerings could be used in certain business use cases</w:t>
+        <w:t xml:space="preserve">Built proof-of-concept (POC) apps to demonstrate how cloud offerings could be used in certain business use cases</w:t>
       </w:r>
     </w:p>
     <w:p>
@@ -570,7 +751,7 @@
         <w:widowControl w:val="0"/>
         <w:numPr>
           <w:ilvl w:val="0"/>
-          <w:numId w:val="2"/>
+          <w:numId w:val="3"/>
         </w:numPr>
         <w:ind w:left="720" w:hanging="360"/>
         <w:rPr>
@@ -587,123 +768,7 @@
           <w:szCs w:val="20"/>
           <w:rtl w:val="0"/>
         </w:rPr>
-        <w:t xml:space="preserve">Deliver presentations and code walkthroughs to colleagues to demonstrate useful concepts and tools</w:t>
-      </w:r>
-    </w:p>
-    <w:p>
-      <w:pPr>
-        <w:widowControl w:val="0"/>
-        <w:numPr>
-          <w:ilvl w:val="0"/>
-          <w:numId w:val="2"/>
-        </w:numPr>
-        <w:ind w:left="720" w:hanging="360"/>
-        <w:rPr>
-          <w:rFonts w:ascii="Times New Roman" w:cs="Times New Roman" w:eastAsia="Times New Roman" w:hAnsi="Times New Roman"/>
-          <w:sz w:val="20"/>
-          <w:szCs w:val="20"/>
-        </w:rPr>
-      </w:pPr>
-      <w:r>
-        <w:rPr>
-          <w:rFonts w:ascii="Times New Roman" w:cs="Times New Roman" w:eastAsia="Times New Roman" w:hAnsi="Times New Roman"/>
-          <w:sz w:val="20"/>
-          <w:szCs w:val="20"/>
-          <w:rtl w:val="0"/>
-        </w:rPr>
-        <w:t xml:space="preserve">Assist colleagues in debugging and walking through full-stack apps</w:t>
-      </w:r>
-    </w:p>
-    <w:p>
-      <w:pPr>
-        <w:widowControl w:val="0"/>
-        <w:numPr>
-          <w:ilvl w:val="0"/>
-          <w:numId w:val="2"/>
-        </w:numPr>
-        <w:ind w:left="720" w:hanging="360"/>
-        <w:rPr>
-          <w:rFonts w:ascii="Times New Roman" w:cs="Times New Roman" w:eastAsia="Times New Roman" w:hAnsi="Times New Roman"/>
-          <w:sz w:val="20"/>
-          <w:szCs w:val="20"/>
-          <w:u w:val="none"/>
-        </w:rPr>
-      </w:pPr>
-      <w:r>
-        <w:rPr>
-          <w:rFonts w:ascii="Times New Roman" w:cs="Times New Roman" w:eastAsia="Times New Roman" w:hAnsi="Times New Roman"/>
-          <w:sz w:val="20"/>
-          <w:szCs w:val="20"/>
-          <w:rtl w:val="0"/>
-        </w:rPr>
-        <w:t xml:space="preserve">Develop full-stack apps that utilize security best-practices: Basic Authentication, Bearer Tokens, BCrypt hashes; with Oracle:</w:t>
-      </w:r>
-    </w:p>
-    <w:p>
-      <w:pPr>
-        <w:widowControl w:val="0"/>
-        <w:numPr>
-          <w:ilvl w:val="0"/>
-          <w:numId w:val="2"/>
-        </w:numPr>
-        <w:ind w:left="720" w:hanging="360"/>
-        <w:rPr>
-          <w:rFonts w:ascii="Times New Roman" w:cs="Times New Roman" w:eastAsia="Times New Roman" w:hAnsi="Times New Roman"/>
-          <w:sz w:val="20"/>
-          <w:szCs w:val="20"/>
-          <w:u w:val="none"/>
-        </w:rPr>
-      </w:pPr>
-      <w:r>
-        <w:rPr>
-          <w:rFonts w:ascii="Times New Roman" w:cs="Times New Roman" w:eastAsia="Times New Roman" w:hAnsi="Times New Roman"/>
-          <w:sz w:val="20"/>
-          <w:szCs w:val="20"/>
-          <w:rtl w:val="0"/>
-        </w:rPr>
-        <w:t xml:space="preserve">Showcased how a full-stack Swift app can integrate with OCI Compute using Docker with </w:t>
-      </w:r>
-      <w:hyperlink r:id="rId11">
-        <w:r>
-          <w:rPr>
-            <w:rFonts w:ascii="Times New Roman" w:cs="Times New Roman" w:eastAsia="Times New Roman" w:hAnsi="Times New Roman"/>
-            <w:color w:val="1155cc"/>
-            <w:sz w:val="20"/>
-            <w:szCs w:val="20"/>
-            <w:u w:val="single"/>
-            <w:rtl w:val="0"/>
-          </w:rPr>
-          <w:t xml:space="preserve">coupon-retailer-shopper-app</w:t>
-        </w:r>
-      </w:hyperlink>
-      <w:r>
-        <w:rPr>
-          <w:rtl w:val="0"/>
-        </w:rPr>
-      </w:r>
-    </w:p>
-    <w:p>
-      <w:pPr>
-        <w:widowControl w:val="0"/>
-        <w:numPr>
-          <w:ilvl w:val="0"/>
-          <w:numId w:val="2"/>
-        </w:numPr>
-        <w:ind w:left="720" w:hanging="360"/>
-        <w:rPr>
-          <w:rFonts w:ascii="Times New Roman" w:cs="Times New Roman" w:eastAsia="Times New Roman" w:hAnsi="Times New Roman"/>
-          <w:sz w:val="20"/>
-          <w:szCs w:val="20"/>
-        </w:rPr>
-      </w:pPr>
-      <w:r>
-        <w:rPr>
-          <w:rFonts w:ascii="Times New Roman" w:cs="Times New Roman" w:eastAsia="Times New Roman" w:hAnsi="Times New Roman"/>
-          <w:sz w:val="20"/>
-          <w:szCs w:val="20"/>
-          <w:rtl w:val="0"/>
-        </w:rPr>
-        <w:t xml:space="preserve">Demoed how to </w:t>
+        <w:t xml:space="preserve">Developed a </w:t>
       </w:r>
       <w:hyperlink r:id="rId12">
         <w:r>
@@ -715,7 +780,7 @@
             <w:u w:val="single"/>
             <w:rtl w:val="0"/>
           </w:rPr>
-          <w:t xml:space="preserve">interface</w:t>
+          <w:t xml:space="preserve">full-stack Swift app</w:t>
         </w:r>
       </w:hyperlink>
       <w:r>
@@ -725,7 +790,40 @@
           <w:szCs w:val="20"/>
           <w:rtl w:val="0"/>
         </w:rPr>
-        <w:t xml:space="preserve"> a JS REST API with a DB on Oracle Mobile Hub by extending </w:t>
+        <w:t xml:space="preserve"> (using token auth, BCrypt hashes), and integrated it</w:t>
+      </w:r>
+      <w:r>
+        <w:rPr>
+          <w:rFonts w:ascii="Times New Roman" w:cs="Times New Roman" w:eastAsia="Times New Roman" w:hAnsi="Times New Roman"/>
+          <w:sz w:val="20"/>
+          <w:szCs w:val="20"/>
+          <w:rtl w:val="0"/>
+        </w:rPr>
+        <w:t xml:space="preserve"> with OCI Compute using Docker</w:t>
+      </w:r>
+    </w:p>
+    <w:p>
+      <w:pPr>
+        <w:widowControl w:val="0"/>
+        <w:numPr>
+          <w:ilvl w:val="0"/>
+          <w:numId w:val="3"/>
+        </w:numPr>
+        <w:ind w:left="720" w:hanging="360"/>
+        <w:rPr>
+          <w:rFonts w:ascii="Times New Roman" w:cs="Times New Roman" w:eastAsia="Times New Roman" w:hAnsi="Times New Roman"/>
+          <w:sz w:val="20"/>
+          <w:szCs w:val="20"/>
+        </w:rPr>
+      </w:pPr>
+      <w:r>
+        <w:rPr>
+          <w:rFonts w:ascii="Times New Roman" w:cs="Times New Roman" w:eastAsia="Times New Roman" w:hAnsi="Times New Roman"/>
+          <w:sz w:val="20"/>
+          <w:szCs w:val="20"/>
+          <w:rtl w:val="0"/>
+        </w:rPr>
+        <w:t xml:space="preserve">Gamified a </w:t>
       </w:r>
       <w:hyperlink r:id="rId13">
         <w:r>
@@ -737,9 +835,84 @@
             <w:u w:val="single"/>
             <w:rtl w:val="0"/>
           </w:rPr>
-          <w:t xml:space="preserve">a React Native app, as MovieClub</w:t>
+          <w:t xml:space="preserve">RN movie app</w:t>
         </w:r>
       </w:hyperlink>
+      <w:r>
+        <w:rPr>
+          <w:rFonts w:ascii="Times New Roman" w:cs="Times New Roman" w:eastAsia="Times New Roman" w:hAnsi="Times New Roman"/>
+          <w:sz w:val="20"/>
+          <w:szCs w:val="20"/>
+          <w:rtl w:val="0"/>
+        </w:rPr>
+        <w:t xml:space="preserve"> by building </w:t>
+      </w:r>
+      <w:hyperlink r:id="rId14">
+        <w:r>
+          <w:rPr>
+            <w:rFonts w:ascii="Times New Roman" w:cs="Times New Roman" w:eastAsia="Times New Roman" w:hAnsi="Times New Roman"/>
+            <w:color w:val="1155cc"/>
+            <w:sz w:val="20"/>
+            <w:szCs w:val="20"/>
+            <w:u w:val="single"/>
+            <w:rtl w:val="0"/>
+          </w:rPr>
+          <w:t xml:space="preserve">comment/rate</w:t>
+        </w:r>
+      </w:hyperlink>
+      <w:r>
+        <w:rPr>
+          <w:rFonts w:ascii="Times New Roman" w:cs="Times New Roman" w:eastAsia="Times New Roman" w:hAnsi="Times New Roman"/>
+          <w:sz w:val="20"/>
+          <w:szCs w:val="20"/>
+          <w:rtl w:val="0"/>
+        </w:rPr>
+        <w:t xml:space="preserve"> (Oracle Mobile Hub), </w:t>
+      </w:r>
+      <w:hyperlink r:id="rId15">
+        <w:r>
+          <w:rPr>
+            <w:rFonts w:ascii="Times New Roman" w:cs="Times New Roman" w:eastAsia="Times New Roman" w:hAnsi="Times New Roman"/>
+            <w:color w:val="1155cc"/>
+            <w:sz w:val="20"/>
+            <w:szCs w:val="20"/>
+            <w:u w:val="single"/>
+            <w:rtl w:val="0"/>
+          </w:rPr>
+          <w:t xml:space="preserve">chat</w:t>
+        </w:r>
+      </w:hyperlink>
+      <w:r>
+        <w:rPr>
+          <w:rFonts w:ascii="Times New Roman" w:cs="Times New Roman" w:eastAsia="Times New Roman" w:hAnsi="Times New Roman"/>
+          <w:sz w:val="20"/>
+          <w:szCs w:val="20"/>
+          <w:rtl w:val="0"/>
+        </w:rPr>
+        <w:t xml:space="preserve"> (WebSockets), and </w:t>
+      </w:r>
+      <w:hyperlink r:id="rId16">
+        <w:r>
+          <w:rPr>
+            <w:rFonts w:ascii="Times New Roman" w:cs="Times New Roman" w:eastAsia="Times New Roman" w:hAnsi="Times New Roman"/>
+            <w:color w:val="1155cc"/>
+            <w:sz w:val="20"/>
+            <w:szCs w:val="20"/>
+            <w:u w:val="single"/>
+            <w:rtl w:val="0"/>
+          </w:rPr>
+          <w:t xml:space="preserve">recommend</w:t>
+        </w:r>
+      </w:hyperlink>
+      <w:r>
+        <w:rPr>
+          <w:rFonts w:ascii="Times New Roman" w:cs="Times New Roman" w:eastAsia="Times New Roman" w:hAnsi="Times New Roman"/>
+          <w:sz w:val="20"/>
+          <w:szCs w:val="20"/>
+          <w:rtl w:val="0"/>
+        </w:rPr>
+        <w:t xml:space="preserve"> μ-services</w:t>
+      </w:r>
       <w:r>
         <w:rPr>
           <w:rtl w:val="0"/>
@@ -767,9 +940,9 @@
           <w:szCs w:val="20"/>
           <w:rtl w:val="0"/>
         </w:rPr>
-        <w:t xml:space="preserve">Documented how to set up Python 3 on Oracle Linux 7 through a </w:t>
-      </w:r>
-      <w:hyperlink r:id="rId14">
+        <w:t xml:space="preserve">Stress-tested a SQL database for a customer by writing a </w:t>
+      </w:r>
+      <w:hyperlink r:id="rId17">
         <w:r>
           <w:rPr>
             <w:rFonts w:ascii="Times New Roman" w:cs="Times New Roman" w:eastAsia="Times New Roman" w:hAnsi="Times New Roman"/>
@@ -789,7 +962,7 @@
           <w:szCs w:val="20"/>
           <w:rtl w:val="0"/>
         </w:rPr>
-        <w:t xml:space="preserve"> that puts numBytes of CLOBs in a SQL DB</w:t>
+        <w:t xml:space="preserve"> that inserts numBytes of CLOBs</w:t>
       </w:r>
       <w:r>
         <w:rPr>
@@ -802,7 +975,7 @@
         <w:widowControl w:val="0"/>
         <w:numPr>
           <w:ilvl w:val="0"/>
-          <w:numId w:val="2"/>
+          <w:numId w:val="3"/>
         </w:numPr>
         <w:ind w:left="720" w:hanging="360"/>
         <w:rPr>
@@ -819,9 +992,9 @@
           <w:szCs w:val="20"/>
           <w:rtl w:val="0"/>
         </w:rPr>
-        <w:t xml:space="preserve">Illustrated how an Oracle Digital Assistant integrates with a Swift iPhone app (via the iOS SDK) </w:t>
-      </w:r>
-      <w:hyperlink r:id="rId15">
+        <w:t xml:space="preserve">Coded up a </w:t>
+      </w:r>
+      <w:hyperlink r:id="rId18">
         <w:r>
           <w:rPr>
             <w:rFonts w:ascii="Times New Roman" w:cs="Times New Roman" w:eastAsia="Times New Roman" w:hAnsi="Times New Roman"/>
@@ -831,7 +1004,7 @@
             <w:u w:val="single"/>
             <w:rtl w:val="0"/>
           </w:rPr>
-          <w:t xml:space="preserve">and REST API</w:t>
+          <w:t xml:space="preserve">REST API</w:t>
         </w:r>
       </w:hyperlink>
       <w:r>
@@ -841,7 +1014,7 @@
           <w:szCs w:val="20"/>
           <w:rtl w:val="0"/>
         </w:rPr>
-        <w:t xml:space="preserve"> (in Go)</w:t>
+        <w:t xml:space="preserve"> to integrate a digital assistant with OCI for a sales rep working with a burger chain</w:t>
       </w:r>
     </w:p>
     <w:p>
@@ -849,7 +1022,7 @@
         <w:widowControl w:val="0"/>
         <w:numPr>
           <w:ilvl w:val="0"/>
-          <w:numId w:val="2"/>
+          <w:numId w:val="3"/>
         </w:numPr>
         <w:ind w:left="720" w:hanging="360"/>
         <w:rPr>
@@ -866,9 +1039,9 @@
           <w:szCs w:val="20"/>
           <w:rtl w:val="0"/>
         </w:rPr>
-        <w:t xml:space="preserve">Improved chatbot development by building a stand-alone </w:t>
-      </w:r>
-      <w:hyperlink r:id="rId16">
+        <w:t xml:space="preserve">Built a stand-alone, declarative </w:t>
+      </w:r>
+      <w:hyperlink r:id="rId19">
         <w:r>
           <w:rPr>
             <w:rFonts w:ascii="Times New Roman" w:cs="Times New Roman" w:eastAsia="Times New Roman" w:hAnsi="Times New Roman"/>
@@ -888,31 +1061,7 @@
           <w:szCs w:val="20"/>
           <w:rtl w:val="0"/>
         </w:rPr>
-        <w:t xml:space="preserve"> as a visual way to program chat YAML</w:t>
-      </w:r>
-    </w:p>
-    <w:p>
-      <w:pPr>
-        <w:widowControl w:val="0"/>
-        <w:numPr>
-          <w:ilvl w:val="1"/>
-          <w:numId w:val="2"/>
-        </w:numPr>
-        <w:ind w:left="1440" w:hanging="360"/>
-        <w:rPr>
-          <w:rFonts w:ascii="Times New Roman" w:cs="Times New Roman" w:eastAsia="Times New Roman" w:hAnsi="Times New Roman"/>
-          <w:sz w:val="20"/>
-          <w:szCs w:val="20"/>
-        </w:rPr>
-      </w:pPr>
-      <w:r>
-        <w:rPr>
-          <w:rFonts w:ascii="Times New Roman" w:cs="Times New Roman" w:eastAsia="Times New Roman" w:hAnsi="Times New Roman"/>
-          <w:sz w:val="20"/>
-          <w:szCs w:val="20"/>
-          <w:rtl w:val="0"/>
-        </w:rPr>
-        <w:t xml:space="preserve">Recognized by PMs on the ODA team as a helpful and creative tool to improve the UI/UX</w:t>
+        <w:t xml:space="preserve"> as a visual way to code a digital assistant YAML, improving dev UI/UX</w:t>
       </w:r>
     </w:p>
     <w:p>
@@ -920,26 +1069,25 @@
         <w:widowControl w:val="0"/>
         <w:numPr>
           <w:ilvl w:val="0"/>
-          <w:numId w:val="2"/>
+          <w:numId w:val="3"/>
         </w:numPr>
         <w:ind w:left="720" w:hanging="360"/>
         <w:rPr>
           <w:rFonts w:ascii="Times New Roman" w:cs="Times New Roman" w:eastAsia="Times New Roman" w:hAnsi="Times New Roman"/>
           <w:sz w:val="20"/>
           <w:szCs w:val="20"/>
-          <w:u w:val="none"/>
-        </w:rPr>
-      </w:pPr>
-      <w:r>
-        <w:rPr>
-          <w:rFonts w:ascii="Times New Roman" w:cs="Times New Roman" w:eastAsia="Times New Roman" w:hAnsi="Times New Roman"/>
-          <w:sz w:val="20"/>
-          <w:szCs w:val="20"/>
-          <w:rtl w:val="0"/>
-        </w:rPr>
-        <w:t xml:space="preserve">Demoed how to use Oracle Streaming Service with a data pipeline and object storage, </w:t>
-      </w:r>
-      <w:hyperlink r:id="rId17">
+        </w:rPr>
+      </w:pPr>
+      <w:r>
+        <w:rPr>
+          <w:rFonts w:ascii="Times New Roman" w:cs="Times New Roman" w:eastAsia="Times New Roman" w:hAnsi="Times New Roman"/>
+          <w:sz w:val="20"/>
+          <w:szCs w:val="20"/>
+          <w:rtl w:val="0"/>
+        </w:rPr>
+        <w:t xml:space="preserve">Demoed how to </w:t>
+      </w:r>
+      <w:hyperlink r:id="rId20">
         <w:r>
           <w:rPr>
             <w:rFonts w:ascii="Times New Roman" w:cs="Times New Roman" w:eastAsia="Times New Roman" w:hAnsi="Times New Roman"/>
@@ -949,11 +1097,20 @@
             <w:u w:val="single"/>
             <w:rtl w:val="0"/>
           </w:rPr>
-          <w:t xml:space="preserve">by wrapping the OCI Python SDK</w:t>
+          <w:t xml:space="preserve">stream real-time temperature data</w:t>
         </w:r>
       </w:hyperlink>
       <w:r>
         <w:rPr>
+          <w:rFonts w:ascii="Times New Roman" w:cs="Times New Roman" w:eastAsia="Times New Roman" w:hAnsi="Times New Roman"/>
+          <w:sz w:val="20"/>
+          <w:szCs w:val="20"/>
+          <w:rtl w:val="0"/>
+        </w:rPr>
+        <w:t xml:space="preserve"> through Oracle Streaming to object storage on intervals (for BI use cases)</w:t>
+      </w:r>
+      <w:r>
+        <w:rPr>
           <w:rtl w:val="0"/>
         </w:rPr>
       </w:r>
@@ -991,9 +1148,9 @@
           <w:szCs w:val="20"/>
           <w:rtl w:val="0"/>
         </w:rPr>
-        <w:t xml:space="preserve">Software Engineer Intern (Node.js), Video Genome Project </w:t>
-      </w:r>
-      <w:hyperlink r:id="rId18">
+        <w:t xml:space="preserve">Software Engineer Intern (Node.js), Video Genome Project (</w:t>
+      </w:r>
+      <w:hyperlink r:id="rId21">
         <w:r>
           <w:rPr>
             <w:rFonts w:ascii="Times New Roman" w:cs="Times New Roman" w:eastAsia="Times New Roman" w:hAnsi="Times New Roman"/>
@@ -1004,30 +1161,26 @@
             <w:u w:val="single"/>
             <w:rtl w:val="0"/>
           </w:rPr>
-          <w:t xml:space="preserve">(VGP</w:t>
+          <w:t xml:space="preserve">VGP</w:t>
         </w:r>
       </w:hyperlink>
-      <w:hyperlink r:id="rId19">
-        <w:r>
-          <w:rPr>
-            <w:rFonts w:ascii="Times New Roman" w:cs="Times New Roman" w:eastAsia="Times New Roman" w:hAnsi="Times New Roman"/>
-            <w:color w:val="1155cc"/>
-            <w:sz w:val="20"/>
-            <w:szCs w:val="20"/>
-            <w:u w:val="single"/>
-            <w:rtl w:val="0"/>
-          </w:rPr>
-          <w:t xml:space="preserve">)</w:t>
-        </w:r>
-      </w:hyperlink>
-      <w:r>
-        <w:rPr>
-          <w:rFonts w:ascii="Times New Roman" w:cs="Times New Roman" w:eastAsia="Times New Roman" w:hAnsi="Times New Roman"/>
-          <w:sz w:val="20"/>
-          <w:szCs w:val="20"/>
-          <w:rtl w:val="0"/>
-        </w:rPr>
-        <w:t xml:space="preserve">                                                       Summer 2015, Summer 2016</w:t>
+      <w:r>
+        <w:rPr>
+          <w:rFonts w:ascii="Times New Roman" w:cs="Times New Roman" w:eastAsia="Times New Roman" w:hAnsi="Times New Roman"/>
+          <w:sz w:val="20"/>
+          <w:szCs w:val="20"/>
+          <w:rtl w:val="0"/>
+        </w:rPr>
+        <w:t xml:space="preserve">, later acquired by Hulu)</w:t>
+      </w:r>
+      <w:r>
+        <w:rPr>
+          <w:rFonts w:ascii="Times New Roman" w:cs="Times New Roman" w:eastAsia="Times New Roman" w:hAnsi="Times New Roman"/>
+          <w:sz w:val="20"/>
+          <w:szCs w:val="20"/>
+          <w:rtl w:val="0"/>
+        </w:rPr>
+        <w:t xml:space="preserve">                 Summer 2015, Summer 2016</w:t>
       </w:r>
       <w:r>
         <w:rPr>
@@ -1071,7 +1224,7 @@
         </w:rPr>
         <w:t xml:space="preserve"> – </w:t>
       </w:r>
-      <w:hyperlink r:id="rId20">
+      <w:hyperlink r:id="rId22">
         <w:r>
           <w:rPr>
             <w:rFonts w:ascii="Times New Roman" w:cs="Times New Roman" w:eastAsia="Times New Roman" w:hAnsi="Times New Roman"/>
@@ -1095,7 +1248,7 @@
         <w:widowControl w:val="0"/>
         <w:numPr>
           <w:ilvl w:val="0"/>
-          <w:numId w:val="2"/>
+          <w:numId w:val="3"/>
         </w:numPr>
         <w:pBdr>
           <w:top w:space="0" w:sz="0" w:val="nil"/>
@@ -1119,7 +1272,7 @@
           <w:szCs w:val="20"/>
           <w:rtl w:val="0"/>
         </w:rPr>
-        <w:t xml:space="preserve">Used Postgresql queries and scripts, BASH and occasional Node.js utility-scripts to increase productivity</w:t>
+        <w:t xml:space="preserve">Leveraged Node.js (Cheerio, Lodash, Async), Postgresql, and BASH to perform ETL for a B2B movie analytics platform</w:t>
       </w:r>
     </w:p>
     <w:p>
@@ -1127,7 +1280,7 @@
         <w:widowControl w:val="0"/>
         <w:numPr>
           <w:ilvl w:val="0"/>
-          <w:numId w:val="2"/>
+          <w:numId w:val="3"/>
         </w:numPr>
         <w:pBdr>
           <w:top w:space="0" w:sz="0" w:val="nil"/>
@@ -1142,16 +1295,17 @@
           <w:rFonts w:ascii="Times New Roman" w:cs="Times New Roman" w:eastAsia="Times New Roman" w:hAnsi="Times New Roman"/>
           <w:sz w:val="20"/>
           <w:szCs w:val="20"/>
-        </w:rPr>
-      </w:pPr>
-      <w:r>
-        <w:rPr>
-          <w:rFonts w:ascii="Times New Roman" w:cs="Times New Roman" w:eastAsia="Times New Roman" w:hAnsi="Times New Roman"/>
-          <w:sz w:val="20"/>
-          <w:szCs w:val="20"/>
-          <w:rtl w:val="0"/>
-        </w:rPr>
-        <w:t xml:space="preserve">Grew vigilant of runtime subtleties (e.g., how the V8 GC generally works when dealing with big data)</w:t>
+          <w:u w:val="none"/>
+        </w:rPr>
+      </w:pPr>
+      <w:r>
+        <w:rPr>
+          <w:rFonts w:ascii="Times New Roman" w:cs="Times New Roman" w:eastAsia="Times New Roman" w:hAnsi="Times New Roman"/>
+          <w:sz w:val="20"/>
+          <w:szCs w:val="20"/>
+          <w:rtl w:val="0"/>
+        </w:rPr>
+        <w:t xml:space="preserve">Wrote and deployed microservice web scrapers (JavaScript) that parsed movie review listings</w:t>
       </w:r>
     </w:p>
     <w:p>
@@ -1159,7 +1313,7 @@
         <w:widowControl w:val="0"/>
         <w:numPr>
           <w:ilvl w:val="0"/>
-          <w:numId w:val="2"/>
+          <w:numId w:val="3"/>
         </w:numPr>
         <w:pBdr>
           <w:top w:space="0" w:sz="0" w:val="nil"/>
@@ -1174,16 +1328,49 @@
           <w:rFonts w:ascii="Times New Roman" w:cs="Times New Roman" w:eastAsia="Times New Roman" w:hAnsi="Times New Roman"/>
           <w:sz w:val="20"/>
           <w:szCs w:val="20"/>
-        </w:rPr>
-      </w:pPr>
-      <w:r>
-        <w:rPr>
-          <w:rFonts w:ascii="Times New Roman" w:cs="Times New Roman" w:eastAsia="Times New Roman" w:hAnsi="Times New Roman"/>
-          <w:sz w:val="20"/>
-          <w:szCs w:val="20"/>
-          <w:rtl w:val="0"/>
-        </w:rPr>
-        <w:t xml:space="preserve">Refactored files to fit current style and updated syntax due to new language or library syntax (improving readability)</w:t>
+          <w:u w:val="none"/>
+        </w:rPr>
+      </w:pPr>
+      <w:r>
+        <w:rPr>
+          <w:rFonts w:ascii="Times New Roman" w:cs="Times New Roman" w:eastAsia="Times New Roman" w:hAnsi="Times New Roman"/>
+          <w:sz w:val="20"/>
+          <w:szCs w:val="20"/>
+          <w:rtl w:val="0"/>
+        </w:rPr>
+        <w:t xml:space="preserve">Cleaned movie review data in JavaScript to only keep relevant information, then saved the data using a standardized schema</w:t>
+      </w:r>
+    </w:p>
+    <w:p>
+      <w:pPr>
+        <w:widowControl w:val="0"/>
+        <w:numPr>
+          <w:ilvl w:val="0"/>
+          <w:numId w:val="3"/>
+        </w:numPr>
+        <w:pBdr>
+          <w:top w:space="0" w:sz="0" w:val="nil"/>
+          <w:left w:space="0" w:sz="0" w:val="nil"/>
+          <w:bottom w:space="0" w:sz="0" w:val="nil"/>
+          <w:right w:space="0" w:sz="0" w:val="nil"/>
+          <w:between w:space="0" w:sz="0" w:val="nil"/>
+        </w:pBdr>
+        <w:shd w:fill="auto" w:val="clear"/>
+        <w:ind w:left="720" w:hanging="360"/>
+        <w:rPr>
+          <w:rFonts w:ascii="Times New Roman" w:cs="Times New Roman" w:eastAsia="Times New Roman" w:hAnsi="Times New Roman"/>
+          <w:sz w:val="20"/>
+          <w:szCs w:val="20"/>
+        </w:rPr>
+      </w:pPr>
+      <w:r>
+        <w:rPr>
+          <w:rFonts w:ascii="Times New Roman" w:cs="Times New Roman" w:eastAsia="Times New Roman" w:hAnsi="Times New Roman"/>
+          <w:sz w:val="20"/>
+          <w:szCs w:val="20"/>
+          <w:rtl w:val="0"/>
+        </w:rPr>
+        <w:t xml:space="preserve">Refactored JavaScript closures that referenced memory for too long and weren’t GC’d when needed (ie, movieData == null)</w:t>
       </w:r>
     </w:p>
     <w:p>
@@ -1191,7 +1378,7 @@
         <w:widowControl w:val="0"/>
         <w:numPr>
           <w:ilvl w:val="1"/>
-          <w:numId w:val="2"/>
+          <w:numId w:val="3"/>
         </w:numPr>
         <w:pBdr>
           <w:top w:space="0" w:sz="0" w:val="nil"/>
@@ -1215,7 +1402,7 @@
           <w:szCs w:val="20"/>
           <w:rtl w:val="0"/>
         </w:rPr>
-        <w:t xml:space="preserve">Repaired ~15 AWS EC2 linux machine states when processes would be in an unexpected or undesired state</w:t>
+        <w:t xml:space="preserve">Repaired ~15 AWS EC2 linux machine states due to memory (no swap files, bad closure usage) or other RT errors</w:t>
       </w:r>
     </w:p>
     <w:p>
@@ -1223,7 +1410,40 @@
         <w:widowControl w:val="0"/>
         <w:numPr>
           <w:ilvl w:val="0"/>
-          <w:numId w:val="2"/>
+          <w:numId w:val="3"/>
+        </w:numPr>
+        <w:ind w:left="720" w:hanging="360"/>
+        <w:rPr>
+          <w:rFonts w:ascii="Times New Roman" w:cs="Times New Roman" w:eastAsia="Times New Roman" w:hAnsi="Times New Roman"/>
+          <w:sz w:val="20"/>
+          <w:szCs w:val="20"/>
+        </w:rPr>
+      </w:pPr>
+      <w:r>
+        <w:rPr>
+          <w:rFonts w:ascii="Times New Roman" w:cs="Times New Roman" w:eastAsia="Times New Roman" w:hAnsi="Times New Roman"/>
+          <w:sz w:val="20"/>
+          <w:szCs w:val="20"/>
+          <w:rtl w:val="0"/>
+        </w:rPr>
+        <w:t xml:space="preserve">Built a </w:t>
+      </w:r>
+      <w:r>
+        <w:rPr>
+          <w:rFonts w:ascii="Times New Roman" w:cs="Times New Roman" w:eastAsia="Times New Roman" w:hAnsi="Times New Roman"/>
+          <w:sz w:val="20"/>
+          <w:szCs w:val="20"/>
+          <w:rtl w:val="0"/>
+        </w:rPr>
+        <w:t xml:space="preserve">Casper.js crawler to log into a social networking website and scrape news data for the daily news dashboard</w:t>
+      </w:r>
+    </w:p>
+    <w:p>
+      <w:pPr>
+        <w:widowControl w:val="0"/>
+        <w:numPr>
+          <w:ilvl w:val="0"/>
+          <w:numId w:val="3"/>
         </w:numPr>
         <w:pBdr>
           <w:top w:space="0" w:sz="0" w:val="nil"/>
@@ -1247,12 +1467,7 @@
           <w:szCs w:val="20"/>
           <w:rtl w:val="0"/>
         </w:rPr>
-        <w:t xml:space="preserve">Parsed web pages in Node.js by loading the HTML into Cheerio.js, with Lodash.js and an existing company API</w:t>
-      </w:r>
-      <w:r>
-        <w:rPr>
-          <w:rtl w:val="0"/>
-        </w:rPr>
+        <w:t xml:space="preserve">Exhaustively tested my Git branch on a clean server environment, then merged locally and created pull requests</w:t>
       </w:r>
     </w:p>
     <w:p>
@@ -1260,31 +1475,7 @@
         <w:widowControl w:val="0"/>
         <w:numPr>
           <w:ilvl w:val="0"/>
-          <w:numId w:val="2"/>
-        </w:numPr>
-        <w:ind w:left="720" w:hanging="360"/>
-        <w:rPr>
-          <w:rFonts w:ascii="Times New Roman" w:cs="Times New Roman" w:eastAsia="Times New Roman" w:hAnsi="Times New Roman"/>
-          <w:sz w:val="20"/>
-          <w:szCs w:val="20"/>
-        </w:rPr>
-      </w:pPr>
-      <w:r>
-        <w:rPr>
-          <w:rFonts w:ascii="Times New Roman" w:cs="Times New Roman" w:eastAsia="Times New Roman" w:hAnsi="Times New Roman"/>
-          <w:sz w:val="20"/>
-          <w:szCs w:val="20"/>
-          <w:rtl w:val="0"/>
-        </w:rPr>
-        <w:t xml:space="preserve">Leveraged Casper.js to scrape web pages</w:t>
-      </w:r>
-    </w:p>
-    <w:p>
-      <w:pPr>
-        <w:widowControl w:val="0"/>
-        <w:numPr>
-          <w:ilvl w:val="0"/>
-          <w:numId w:val="2"/>
+          <w:numId w:val="3"/>
         </w:numPr>
         <w:pBdr>
           <w:top w:space="0" w:sz="0" w:val="nil"/>
@@ -1308,16 +1499,30 @@
           <w:szCs w:val="20"/>
           <w:rtl w:val="0"/>
         </w:rPr>
-        <w:t xml:space="preserve">Refactored Node.js company codebase using callbacks with Async.js to extend existing functionality</w:t>
-      </w:r>
-    </w:p>
-    <w:p>
-      <w:pPr>
-        <w:widowControl w:val="0"/>
-        <w:numPr>
-          <w:ilvl w:val="0"/>
-          <w:numId w:val="2"/>
-        </w:numPr>
+        <w:t xml:space="preserve">Tracked tasks on Jira, while practicing Agile (made frequent commits, local merges, pushed upstream</w:t>
+      </w:r>
+      <w:r>
+        <w:rPr>
+          <w:rFonts w:ascii="Times New Roman" w:cs="Times New Roman" w:eastAsia="Times New Roman" w:hAnsi="Times New Roman"/>
+          <w:sz w:val="20"/>
+          <w:szCs w:val="20"/>
+          <w:rtl w:val="0"/>
+        </w:rPr>
+        <w:t xml:space="preserve"> when well-tested</w:t>
+      </w:r>
+      <w:r>
+        <w:rPr>
+          <w:rFonts w:ascii="Times New Roman" w:cs="Times New Roman" w:eastAsia="Times New Roman" w:hAnsi="Times New Roman"/>
+          <w:sz w:val="20"/>
+          <w:szCs w:val="20"/>
+          <w:rtl w:val="0"/>
+        </w:rPr>
+        <w:t xml:space="preserve">)</w:t>
+      </w:r>
+    </w:p>
+    <w:p>
+      <w:pPr>
+        <w:widowControl w:val="0"/>
         <w:pBdr>
           <w:top w:space="0" w:sz="0" w:val="nil"/>
           <w:left w:space="0" w:sz="0" w:val="nil"/>
@@ -1326,30 +1531,26 @@
           <w:between w:space="0" w:sz="0" w:val="nil"/>
         </w:pBdr>
         <w:shd w:fill="auto" w:val="clear"/>
-        <w:ind w:left="720" w:hanging="360"/>
-        <w:rPr>
-          <w:rFonts w:ascii="Times New Roman" w:cs="Times New Roman" w:eastAsia="Times New Roman" w:hAnsi="Times New Roman"/>
-          <w:sz w:val="20"/>
-          <w:szCs w:val="20"/>
-        </w:rPr>
-      </w:pPr>
-      <w:r>
-        <w:rPr>
-          <w:rFonts w:ascii="Times New Roman" w:cs="Times New Roman" w:eastAsia="Times New Roman" w:hAnsi="Times New Roman"/>
-          <w:sz w:val="20"/>
-          <w:szCs w:val="20"/>
-          <w:rtl w:val="0"/>
-        </w:rPr>
-        <w:t xml:space="preserve">Added new SQL alter scripts to be run in the next company milestone branch</w:t>
-      </w:r>
-    </w:p>
-    <w:p>
-      <w:pPr>
-        <w:widowControl w:val="0"/>
-        <w:numPr>
-          <w:ilvl w:val="0"/>
-          <w:numId w:val="2"/>
-        </w:numPr>
+        <w:rPr>
+          <w:rFonts w:ascii="Times New Roman" w:cs="Times New Roman" w:eastAsia="Times New Roman" w:hAnsi="Times New Roman"/>
+          <w:sz w:val="12"/>
+          <w:szCs w:val="12"/>
+        </w:rPr>
+      </w:pPr>
+      <w:r>
+        <w:pict>
+          <v:rect style="width:0.0pt;height:1.5pt" o:hr="t" o:hrstd="t" o:hralign="center" fillcolor="#A0A0A0" stroked="f"/>
+        </w:pict>
+      </w:r>
+      <w:r>
+        <w:rPr>
+          <w:rtl w:val="0"/>
+        </w:rPr>
+      </w:r>
+    </w:p>
+    <w:p>
+      <w:pPr>
+        <w:widowControl w:val="0"/>
         <w:pBdr>
           <w:top w:space="0" w:sz="0" w:val="nil"/>
           <w:left w:space="0" w:sz="0" w:val="nil"/>
@@ -1358,30 +1559,23 @@
           <w:between w:space="0" w:sz="0" w:val="nil"/>
         </w:pBdr>
         <w:shd w:fill="auto" w:val="clear"/>
-        <w:ind w:left="720" w:hanging="360"/>
-        <w:rPr>
-          <w:rFonts w:ascii="Times New Roman" w:cs="Times New Roman" w:eastAsia="Times New Roman" w:hAnsi="Times New Roman"/>
-          <w:sz w:val="20"/>
-          <w:szCs w:val="20"/>
-        </w:rPr>
-      </w:pPr>
-      <w:r>
-        <w:rPr>
-          <w:rFonts w:ascii="Times New Roman" w:cs="Times New Roman" w:eastAsia="Times New Roman" w:hAnsi="Times New Roman"/>
-          <w:sz w:val="20"/>
-          <w:szCs w:val="20"/>
-          <w:rtl w:val="0"/>
-        </w:rPr>
-        <w:t xml:space="preserve">Wrote test files for production; checked conditions that would otherwise crash the server</w:t>
-      </w:r>
-    </w:p>
-    <w:p>
-      <w:pPr>
-        <w:widowControl w:val="0"/>
-        <w:numPr>
-          <w:ilvl w:val="0"/>
-          <w:numId w:val="2"/>
-        </w:numPr>
+        <w:rPr>
+          <w:rFonts w:ascii="Times New Roman" w:cs="Times New Roman" w:eastAsia="Times New Roman" w:hAnsi="Times New Roman"/>
+          <w:b w:val="1"/>
+        </w:rPr>
+      </w:pPr>
+      <w:r>
+        <w:rPr>
+          <w:rFonts w:ascii="Times New Roman" w:cs="Times New Roman" w:eastAsia="Times New Roman" w:hAnsi="Times New Roman"/>
+          <w:b w:val="1"/>
+          <w:rtl w:val="0"/>
+        </w:rPr>
+        <w:t xml:space="preserve">PROJECTS</w:t>
+      </w:r>
+    </w:p>
+    <w:p>
+      <w:pPr>
+        <w:widowControl w:val="0"/>
         <w:pBdr>
           <w:top w:space="0" w:sz="0" w:val="nil"/>
           <w:left w:space="0" w:sz="0" w:val="nil"/>
@@ -1390,30 +1584,22 @@
           <w:between w:space="0" w:sz="0" w:val="nil"/>
         </w:pBdr>
         <w:shd w:fill="auto" w:val="clear"/>
-        <w:ind w:left="720" w:hanging="360"/>
-        <w:rPr>
-          <w:rFonts w:ascii="Times New Roman" w:cs="Times New Roman" w:eastAsia="Times New Roman" w:hAnsi="Times New Roman"/>
-          <w:sz w:val="20"/>
-          <w:szCs w:val="20"/>
-        </w:rPr>
-      </w:pPr>
-      <w:r>
-        <w:rPr>
-          <w:rFonts w:ascii="Times New Roman" w:cs="Times New Roman" w:eastAsia="Times New Roman" w:hAnsi="Times New Roman"/>
-          <w:sz w:val="20"/>
-          <w:szCs w:val="20"/>
-          <w:rtl w:val="0"/>
-        </w:rPr>
-        <w:t xml:space="preserve">Exhaustively tested my Git branch on a clean server environment before I merged locally and created pull requests</w:t>
-      </w:r>
-    </w:p>
-    <w:p>
-      <w:pPr>
-        <w:widowControl w:val="0"/>
-        <w:numPr>
-          <w:ilvl w:val="0"/>
-          <w:numId w:val="2"/>
-        </w:numPr>
+        <w:rPr>
+          <w:rFonts w:ascii="Times New Roman" w:cs="Times New Roman" w:eastAsia="Times New Roman" w:hAnsi="Times New Roman"/>
+          <w:b w:val="1"/>
+          <w:sz w:val="4"/>
+          <w:szCs w:val="4"/>
+        </w:rPr>
+      </w:pPr>
+      <w:r>
+        <w:rPr>
+          <w:rtl w:val="0"/>
+        </w:rPr>
+      </w:r>
+    </w:p>
+    <w:p>
+      <w:pPr>
+        <w:widowControl w:val="0"/>
         <w:pBdr>
           <w:top w:space="0" w:sz="0" w:val="nil"/>
           <w:left w:space="0" w:sz="0" w:val="nil"/>
@@ -1422,164 +1608,23 @@
           <w:between w:space="0" w:sz="0" w:val="nil"/>
         </w:pBdr>
         <w:shd w:fill="auto" w:val="clear"/>
-        <w:ind w:left="720" w:hanging="360"/>
-        <w:rPr>
-          <w:rFonts w:ascii="Times New Roman" w:cs="Times New Roman" w:eastAsia="Times New Roman" w:hAnsi="Times New Roman"/>
-          <w:sz w:val="20"/>
-          <w:szCs w:val="20"/>
-        </w:rPr>
-      </w:pPr>
-      <w:r>
-        <w:rPr>
-          <w:rFonts w:ascii="Times New Roman" w:cs="Times New Roman" w:eastAsia="Times New Roman" w:hAnsi="Times New Roman"/>
-          <w:sz w:val="20"/>
-          <w:szCs w:val="20"/>
-          <w:rtl w:val="0"/>
-        </w:rPr>
-        <w:t xml:space="preserve">Agile development </w:t>
-      </w:r>
-      <w:r>
-        <w:rPr>
-          <w:rFonts w:ascii="Times New Roman" w:cs="Times New Roman" w:eastAsia="Times New Roman" w:hAnsi="Times New Roman"/>
-          <w:sz w:val="20"/>
-          <w:szCs w:val="20"/>
-          <w:rtl w:val="0"/>
-        </w:rPr>
-        <w:t xml:space="preserve">using</w:t>
-      </w:r>
-      <w:r>
-        <w:rPr>
-          <w:rFonts w:ascii="Times New Roman" w:cs="Times New Roman" w:eastAsia="Times New Roman" w:hAnsi="Times New Roman"/>
-          <w:sz w:val="20"/>
-          <w:szCs w:val="20"/>
-          <w:rtl w:val="0"/>
-        </w:rPr>
-        <w:t xml:space="preserve"> Jira for project-tracking (frequent commits, local merges, pushed upstream</w:t>
-      </w:r>
-      <w:r>
-        <w:rPr>
-          <w:rFonts w:ascii="Times New Roman" w:cs="Times New Roman" w:eastAsia="Times New Roman" w:hAnsi="Times New Roman"/>
-          <w:sz w:val="20"/>
-          <w:szCs w:val="20"/>
-          <w:rtl w:val="0"/>
-        </w:rPr>
-        <w:t xml:space="preserve"> when well-tested</w:t>
-      </w:r>
-      <w:r>
-        <w:rPr>
-          <w:rFonts w:ascii="Times New Roman" w:cs="Times New Roman" w:eastAsia="Times New Roman" w:hAnsi="Times New Roman"/>
-          <w:sz w:val="20"/>
-          <w:szCs w:val="20"/>
-          <w:rtl w:val="0"/>
-        </w:rPr>
-        <w:t xml:space="preserve">)</w:t>
-      </w:r>
-    </w:p>
-    <w:p>
-      <w:pPr>
-        <w:widowControl w:val="0"/>
-        <w:pBdr>
-          <w:top w:space="0" w:sz="0" w:val="nil"/>
-          <w:left w:space="0" w:sz="0" w:val="nil"/>
-          <w:bottom w:space="0" w:sz="0" w:val="nil"/>
-          <w:right w:space="0" w:sz="0" w:val="nil"/>
-          <w:between w:space="0" w:sz="0" w:val="nil"/>
-        </w:pBdr>
-        <w:shd w:fill="auto" w:val="clear"/>
-        <w:rPr>
-          <w:rFonts w:ascii="Times New Roman" w:cs="Times New Roman" w:eastAsia="Times New Roman" w:hAnsi="Times New Roman"/>
-          <w:sz w:val="12"/>
-          <w:szCs w:val="12"/>
-        </w:rPr>
-      </w:pPr>
-      <w:r>
-        <w:pict>
-          <v:rect style="width:0.0pt;height:1.5pt" o:hr="t" o:hrstd="t" o:hralign="center" fillcolor="#A0A0A0" stroked="f"/>
-        </w:pict>
-      </w:r>
-      <w:r>
-        <w:rPr>
-          <w:rtl w:val="0"/>
-        </w:rPr>
-      </w:r>
-    </w:p>
-    <w:p>
-      <w:pPr>
-        <w:widowControl w:val="0"/>
-        <w:pBdr>
-          <w:top w:space="0" w:sz="0" w:val="nil"/>
-          <w:left w:space="0" w:sz="0" w:val="nil"/>
-          <w:bottom w:space="0" w:sz="0" w:val="nil"/>
-          <w:right w:space="0" w:sz="0" w:val="nil"/>
-          <w:between w:space="0" w:sz="0" w:val="nil"/>
-        </w:pBdr>
-        <w:shd w:fill="auto" w:val="clear"/>
+        <w:rPr>
+          <w:rFonts w:ascii="Times New Roman" w:cs="Times New Roman" w:eastAsia="Times New Roman" w:hAnsi="Times New Roman"/>
+          <w:sz w:val="20"/>
+          <w:szCs w:val="20"/>
+        </w:rPr>
+      </w:pPr>
+      <w:r>
         <w:rPr>
           <w:rFonts w:ascii="Times New Roman" w:cs="Times New Roman" w:eastAsia="Times New Roman" w:hAnsi="Times New Roman"/>
           <w:b w:val="1"/>
-        </w:rPr>
-      </w:pPr>
-      <w:r>
-        <w:rPr>
-          <w:rFonts w:ascii="Times New Roman" w:cs="Times New Roman" w:eastAsia="Times New Roman" w:hAnsi="Times New Roman"/>
-          <w:b w:val="1"/>
-          <w:rtl w:val="0"/>
-        </w:rPr>
-        <w:t xml:space="preserve">PROJECTS</w:t>
-      </w:r>
-    </w:p>
-    <w:p>
-      <w:pPr>
-        <w:widowControl w:val="0"/>
-        <w:pBdr>
-          <w:top w:space="0" w:sz="0" w:val="nil"/>
-          <w:left w:space="0" w:sz="0" w:val="nil"/>
-          <w:bottom w:space="0" w:sz="0" w:val="nil"/>
-          <w:right w:space="0" w:sz="0" w:val="nil"/>
-          <w:between w:space="0" w:sz="0" w:val="nil"/>
-        </w:pBdr>
-        <w:shd w:fill="auto" w:val="clear"/>
-        <w:rPr>
-          <w:rFonts w:ascii="Times New Roman" w:cs="Times New Roman" w:eastAsia="Times New Roman" w:hAnsi="Times New Roman"/>
-          <w:b w:val="1"/>
-          <w:sz w:val="4"/>
-          <w:szCs w:val="4"/>
-        </w:rPr>
-      </w:pPr>
-      <w:r>
-        <w:rPr>
-          <w:rtl w:val="0"/>
-        </w:rPr>
-      </w:r>
-    </w:p>
-    <w:p>
-      <w:pPr>
-        <w:widowControl w:val="0"/>
-        <w:pBdr>
-          <w:top w:space="0" w:sz="0" w:val="nil"/>
-          <w:left w:space="0" w:sz="0" w:val="nil"/>
-          <w:bottom w:space="0" w:sz="0" w:val="nil"/>
-          <w:right w:space="0" w:sz="0" w:val="nil"/>
-          <w:between w:space="0" w:sz="0" w:val="nil"/>
-        </w:pBdr>
-        <w:shd w:fill="auto" w:val="clear"/>
-        <w:rPr>
-          <w:rFonts w:ascii="Times New Roman" w:cs="Times New Roman" w:eastAsia="Times New Roman" w:hAnsi="Times New Roman"/>
-          <w:sz w:val="20"/>
-          <w:szCs w:val="20"/>
-        </w:rPr>
-      </w:pPr>
-      <w:r>
-        <w:rPr>
-          <w:rFonts w:ascii="Times New Roman" w:cs="Times New Roman" w:eastAsia="Times New Roman" w:hAnsi="Times New Roman"/>
-          <w:b w:val="1"/>
           <w:sz w:val="20"/>
           <w:szCs w:val="20"/>
           <w:rtl w:val="0"/>
         </w:rPr>
         <w:t xml:space="preserve">JavaScript/TypeScript </w:t>
       </w:r>
-      <w:hyperlink r:id="rId21">
+      <w:hyperlink r:id="rId23">
         <w:r>
           <w:rPr>
             <w:rFonts w:ascii="Times New Roman" w:cs="Times New Roman" w:eastAsia="Times New Roman" w:hAnsi="Times New Roman"/>
@@ -1600,7 +1645,6 @@
           <w:szCs w:val="20"/>
           <w:rtl w:val="0"/>
         </w:rPr>
-        <w:t xml:space="preserve"> (on GitHub)  </w:t>
         <w:tab/>
         <w:tab/>
         <w:tab/>
@@ -1612,7 +1656,7 @@
         <w:tab/>
         <w:t xml:space="preserve">         </w:t>
         <w:tab/>
-        <w:t xml:space="preserve">      2018</w:t>
+        <w:t xml:space="preserve">                    2018</w:t>
       </w:r>
     </w:p>
     <w:p>
@@ -1620,7 +1664,7 @@
         <w:widowControl w:val="0"/>
         <w:numPr>
           <w:ilvl w:val="0"/>
-          <w:numId w:val="2"/>
+          <w:numId w:val="3"/>
         </w:numPr>
         <w:pBdr>
           <w:top w:space="0" w:sz="0" w:val="nil"/>
@@ -1652,7 +1696,7 @@
         <w:widowControl w:val="0"/>
         <w:numPr>
           <w:ilvl w:val="0"/>
-          <w:numId w:val="2"/>
+          <w:numId w:val="3"/>
         </w:numPr>
         <w:ind w:left="720" w:hanging="360"/>
         <w:rPr>
@@ -1706,7 +1750,7 @@
         </w:rPr>
         <w:t xml:space="preserve">Full-Stack, Authenticated </w:t>
       </w:r>
-      <w:hyperlink r:id="rId22">
+      <w:hyperlink r:id="rId24">
         <w:r>
           <w:rPr>
             <w:rFonts w:ascii="Times New Roman" w:cs="Times New Roman" w:eastAsia="Times New Roman" w:hAnsi="Times New Roman"/>
@@ -1728,16 +1772,7 @@
           <w:szCs w:val="20"/>
           <w:rtl w:val="0"/>
         </w:rPr>
-        <w:t xml:space="preserve"> (for self-hosting family photos – </w:t>
-      </w:r>
-      <w:r>
-        <w:rPr>
-          <w:rFonts w:ascii="Times New Roman" w:cs="Times New Roman" w:eastAsia="Times New Roman" w:hAnsi="Times New Roman"/>
-          <w:sz w:val="20"/>
-          <w:szCs w:val="20"/>
-          <w:rtl w:val="0"/>
-        </w:rPr>
-        <w:t xml:space="preserve">on GitHub</w:t>
+        <w:t xml:space="preserve"> </w:t>
       </w:r>
       <w:r>
         <w:rPr>
@@ -1747,7 +1782,7 @@
           <w:szCs w:val="20"/>
           <w:rtl w:val="0"/>
         </w:rPr>
-        <w:t xml:space="preserve">)</w:t>
+        <w:t xml:space="preserve">(for self-hosting family photos)</w:t>
       </w:r>
       <w:r>
         <w:rPr>
@@ -1758,7 +1793,7 @@
         </w:rPr>
         <w:t xml:space="preserve">     </w:t>
         <w:tab/>
-        <w:t xml:space="preserve">                                    January 2019</w:t>
+        <w:t xml:space="preserve">                                                  January 2019</w:t>
       </w:r>
     </w:p>
     <w:p>
@@ -1766,7 +1801,7 @@
         <w:widowControl w:val="0"/>
         <w:numPr>
           <w:ilvl w:val="0"/>
-          <w:numId w:val="2"/>
+          <w:numId w:val="3"/>
         </w:numPr>
         <w:ind w:left="720" w:hanging="360"/>
         <w:rPr>
@@ -1790,7 +1825,7 @@
         <w:widowControl w:val="0"/>
         <w:numPr>
           <w:ilvl w:val="0"/>
-          <w:numId w:val="2"/>
+          <w:numId w:val="3"/>
         </w:numPr>
         <w:ind w:left="720" w:hanging="360"/>
         <w:rPr>
@@ -1814,7 +1849,7 @@
         <w:widowControl w:val="0"/>
         <w:numPr>
           <w:ilvl w:val="0"/>
-          <w:numId w:val="2"/>
+          <w:numId w:val="3"/>
         </w:numPr>
         <w:ind w:left="720" w:hanging="360"/>
         <w:rPr>
@@ -1871,7 +1906,7 @@
         <w:t xml:space="preserve">Pull Requests</w:t>
         <w:tab/>
       </w:r>
-      <w:hyperlink r:id="rId23">
+      <w:hyperlink r:id="rId25">
         <w:r>
           <w:rPr>
             <w:rFonts w:ascii="Times New Roman" w:cs="Times New Roman" w:eastAsia="Times New Roman" w:hAnsi="Times New Roman"/>
@@ -1902,7 +1937,7 @@
         </w:rPr>
         <w:t xml:space="preserve"> </w:t>
       </w:r>
-      <w:hyperlink r:id="rId24">
+      <w:hyperlink r:id="rId26">
         <w:r>
           <w:rPr>
             <w:rFonts w:ascii="Times New Roman" w:cs="Times New Roman" w:eastAsia="Times New Roman" w:hAnsi="Times New Roman"/>
@@ -1933,7 +1968,7 @@
         </w:rPr>
         <w:t xml:space="preserve"> </w:t>
       </w:r>
-      <w:hyperlink r:id="rId25">
+      <w:hyperlink r:id="rId27">
         <w:r>
           <w:rPr>
             <w:rFonts w:ascii="Times New Roman" w:cs="Times New Roman" w:eastAsia="Times New Roman" w:hAnsi="Times New Roman"/>
@@ -1955,7 +1990,7 @@
         </w:rPr>
         <w:t xml:space="preserve"> – update </w:t>
       </w:r>
-      <w:hyperlink r:id="rId26">
+      <w:hyperlink r:id="rId28">
         <w:r>
           <w:rPr>
             <w:rFonts w:ascii="Times New Roman" w:cs="Times New Roman" w:eastAsia="Times New Roman" w:hAnsi="Times New Roman"/>
@@ -2093,7 +2128,7 @@
                 <w:szCs w:val="20"/>
               </w:rPr>
             </w:pPr>
-            <w:hyperlink r:id="rId27">
+            <w:hyperlink r:id="rId29">
               <w:r>
                 <w:rPr>
                   <w:rFonts w:ascii="Times New Roman" w:cs="Times New Roman" w:eastAsia="Times New Roman" w:hAnsi="Times New Roman"/>
@@ -2115,7 +2150,7 @@
                             <pic:cNvPicPr preferRelativeResize="0"/>
                           </pic:nvPicPr>
                           <pic:blipFill>
-                            <a:blip r:embed="rId28"/>
+                            <a:blip r:embed="rId30"/>
                             <a:srcRect b="0" l="0" r="0" t="0"/>
                             <a:stretch>
                               <a:fillRect/>
@@ -2155,7 +2190,7 @@
                 <w:szCs w:val="20"/>
               </w:rPr>
             </w:pPr>
-            <w:hyperlink r:id="rId29">
+            <w:hyperlink r:id="rId31">
               <w:r>
                 <w:rPr>
                   <w:rFonts w:ascii="Times New Roman" w:cs="Times New Roman" w:eastAsia="Times New Roman" w:hAnsi="Times New Roman"/>
@@ -2167,16 +2202,16 @@
                   <wp:inline distB="114300" distT="114300" distL="114300" distR="114300">
                     <wp:extent cx="190500" cy="190500"/>
                     <wp:effectExtent b="0" l="0" r="0" t="0"/>
-                    <wp:docPr id="1" name="image1.png"/>
+                    <wp:docPr id="1" name="image2.png"/>
                     <a:graphic>
                       <a:graphicData uri="http://schemas.openxmlformats.org/drawingml/2006/picture">
                         <pic:pic>
                           <pic:nvPicPr>
-                            <pic:cNvPr id="0" name="image1.png"/>
+                            <pic:cNvPr id="0" name="image2.png"/>
                             <pic:cNvPicPr preferRelativeResize="0"/>
                           </pic:nvPicPr>
                           <pic:blipFill>
-                            <a:blip r:embed="rId30"/>
+                            <a:blip r:embed="rId32"/>
                             <a:srcRect b="0" l="0" r="0" t="0"/>
                             <a:stretch>
                               <a:fillRect/>
@@ -2571,11 +2606,124 @@
       </w:rPr>
     </w:lvl>
   </w:abstractNum>
+  <w:abstractNum w:abstractNumId="3">
+    <w:lvl w:ilvl="0">
+      <w:start w:val="1"/>
+      <w:numFmt w:val="bullet"/>
+      <w:lvlText w:val="●"/>
+      <w:lvlJc w:val="left"/>
+      <w:pPr>
+        <w:ind w:left="720" w:hanging="360"/>
+      </w:pPr>
+      <w:rPr>
+        <w:u w:val="none"/>
+      </w:rPr>
+    </w:lvl>
+    <w:lvl w:ilvl="1">
+      <w:start w:val="1"/>
+      <w:numFmt w:val="bullet"/>
+      <w:lvlText w:val="○"/>
+      <w:lvlJc w:val="left"/>
+      <w:pPr>
+        <w:ind w:left="1440" w:hanging="360"/>
+      </w:pPr>
+      <w:rPr>
+        <w:u w:val="none"/>
+      </w:rPr>
+    </w:lvl>
+    <w:lvl w:ilvl="2">
+      <w:start w:val="1"/>
+      <w:numFmt w:val="bullet"/>
+      <w:lvlText w:val="■"/>
+      <w:lvlJc w:val="left"/>
+      <w:pPr>
+        <w:ind w:left="2160" w:hanging="360"/>
+      </w:pPr>
+      <w:rPr>
+        <w:u w:val="none"/>
+      </w:rPr>
+    </w:lvl>
+    <w:lvl w:ilvl="3">
+      <w:start w:val="1"/>
+      <w:numFmt w:val="bullet"/>
+      <w:lvlText w:val="●"/>
+      <w:lvlJc w:val="left"/>
+      <w:pPr>
+        <w:ind w:left="2880" w:hanging="360"/>
+      </w:pPr>
+      <w:rPr>
+        <w:u w:val="none"/>
+      </w:rPr>
+    </w:lvl>
+    <w:lvl w:ilvl="4">
+      <w:start w:val="1"/>
+      <w:numFmt w:val="bullet"/>
+      <w:lvlText w:val="○"/>
+      <w:lvlJc w:val="left"/>
+      <w:pPr>
+        <w:ind w:left="3600" w:hanging="360"/>
+      </w:pPr>
+      <w:rPr>
+        <w:u w:val="none"/>
+      </w:rPr>
+    </w:lvl>
+    <w:lvl w:ilvl="5">
+      <w:start w:val="1"/>
+      <w:numFmt w:val="bullet"/>
+      <w:lvlText w:val="■"/>
+      <w:lvlJc w:val="left"/>
+      <w:pPr>
+        <w:ind w:left="4320" w:hanging="360"/>
+      </w:pPr>
+      <w:rPr>
+        <w:u w:val="none"/>
+      </w:rPr>
+    </w:lvl>
+    <w:lvl w:ilvl="6">
+      <w:start w:val="1"/>
+      <w:numFmt w:val="bullet"/>
+      <w:lvlText w:val="●"/>
+      <w:lvlJc w:val="left"/>
+      <w:pPr>
+        <w:ind w:left="5040" w:hanging="360"/>
+      </w:pPr>
+      <w:rPr>
+        <w:u w:val="none"/>
+      </w:rPr>
+    </w:lvl>
+    <w:lvl w:ilvl="7">
+      <w:start w:val="1"/>
+      <w:numFmt w:val="bullet"/>
+      <w:lvlText w:val="○"/>
+      <w:lvlJc w:val="left"/>
+      <w:pPr>
+        <w:ind w:left="5760" w:hanging="360"/>
+      </w:pPr>
+      <w:rPr>
+        <w:u w:val="none"/>
+      </w:rPr>
+    </w:lvl>
+    <w:lvl w:ilvl="8">
+      <w:start w:val="1"/>
+      <w:numFmt w:val="bullet"/>
+      <w:lvlText w:val="■"/>
+      <w:lvlJc w:val="left"/>
+      <w:pPr>
+        <w:ind w:left="6480" w:hanging="360"/>
+      </w:pPr>
+      <w:rPr>
+        <w:u w:val="none"/>
+      </w:rPr>
+    </w:lvl>
+  </w:abstractNum>
   <w:num w:numId="1">
     <w:abstractNumId w:val="1"/>
   </w:num>
   <w:num w:numId="2">
     <w:abstractNumId w:val="2"/>
+  </w:num>
+  <w:num w:numId="3">
+    <w:abstractNumId w:val="3"/>
   </w:num>
 </w:numbering>
 </file>

</xml_diff>

<commit_message>
update Projects page with better carousel, add a project, update resume
</commit_message>
<xml_diff>
--- a/public/resume.docx
+++ b/public/resume.docx
@@ -233,26 +233,26 @@
           <w:szCs w:val="20"/>
           <w:rtl w:val="0"/>
         </w:rPr>
-        <w:t xml:space="preserve">  • I’m especially skilled in JavaScript on the front- and back-ends (full-stack), but also have experience building in other languages</w:t>
-      </w:r>
-    </w:p>
-    <w:p>
-      <w:pPr>
-        <w:widowControl w:val="0"/>
-        <w:rPr>
-          <w:rFonts w:ascii="Times New Roman" w:cs="Times New Roman" w:eastAsia="Times New Roman" w:hAnsi="Times New Roman"/>
-          <w:sz w:val="20"/>
-          <w:szCs w:val="20"/>
-        </w:rPr>
-      </w:pPr>
-      <w:r>
-        <w:rPr>
-          <w:rFonts w:ascii="Times New Roman" w:cs="Times New Roman" w:eastAsia="Times New Roman" w:hAnsi="Times New Roman"/>
-          <w:sz w:val="20"/>
-          <w:szCs w:val="20"/>
-          <w:rtl w:val="0"/>
-        </w:rPr>
-        <w:t xml:space="preserve">  • With a CS degree and about 2 years’ experience, I enjoy solving technical problems anywhere on the stack</w:t>
+        <w:t xml:space="preserve">  • I’m especially skilled in modular JavaScript (ES6 – ES2021, styled-components, etc) on the front-end and back-end (full-stack)</w:t>
+      </w:r>
+    </w:p>
+    <w:p>
+      <w:pPr>
+        <w:widowControl w:val="0"/>
+        <w:rPr>
+          <w:rFonts w:ascii="Times New Roman" w:cs="Times New Roman" w:eastAsia="Times New Roman" w:hAnsi="Times New Roman"/>
+          <w:sz w:val="20"/>
+          <w:szCs w:val="20"/>
+        </w:rPr>
+      </w:pPr>
+      <w:r>
+        <w:rPr>
+          <w:rFonts w:ascii="Times New Roman" w:cs="Times New Roman" w:eastAsia="Times New Roman" w:hAnsi="Times New Roman"/>
+          <w:sz w:val="20"/>
+          <w:szCs w:val="20"/>
+          <w:rtl w:val="0"/>
+        </w:rPr>
+        <w:t xml:space="preserve">  • With a CS degree and about 2 years’ experience, I enjoy solving technical problems anywhere on the stack (using any language)</w:t>
       </w:r>
     </w:p>
     <w:p>
@@ -361,7 +361,7 @@
           <w:szCs w:val="20"/>
           <w:rtl w:val="0"/>
         </w:rPr>
-        <w:t xml:space="preserve">TypeScript  –  Python 3   –  Swift 4   –  Golang   –  BASH   –  Docker   –  Mongo   –  SQL (basics)  –  Java  –  System Design (basics)</w:t>
+        <w:t xml:space="preserve">TypeScript –  Python 3  –  C#/.NET –  Swift 4  –  BASH  –  Docker  –  Mongo  –  SQL (basics)  –  Java  –  System Design (basics)</w:t>
       </w:r>
     </w:p>
     <w:p>
@@ -470,7 +470,7 @@
           <w:szCs w:val="20"/>
           <w:rtl w:val="0"/>
         </w:rPr>
-        <w:t xml:space="preserve">Freelance Software Engineer, Computer Science/Programming Tutor</w:t>
+        <w:t xml:space="preserve">Freelance Software Engineer, Computer Science / Programming Tutor</w:t>
       </w:r>
       <w:r>
         <w:rPr>
@@ -501,7 +501,7 @@
           <w:szCs w:val="20"/>
           <w:rtl w:val="0"/>
         </w:rPr>
-        <w:t xml:space="preserve">)                          March 2020 – Present</w:t>
+        <w:t xml:space="preserve">)                        March 2020 – Present</w:t>
       </w:r>
     </w:p>
     <w:p>
@@ -658,21 +658,16 @@
           <w:szCs w:val="20"/>
           <w:rtl w:val="0"/>
         </w:rPr>
-        <w:t xml:space="preserve">Engineer, Oracle</w:t>
-      </w:r>
-      <w:r>
-        <w:rPr>
-          <w:rFonts w:ascii="Times New Roman" w:cs="Times New Roman" w:eastAsia="Times New Roman" w:hAnsi="Times New Roman"/>
-          <w:sz w:val="20"/>
-          <w:szCs w:val="20"/>
-          <w:rtl w:val="0"/>
-        </w:rPr>
-        <w:t xml:space="preserve">                                                                                                                                                 July 2018 – January 2020</w:t>
-      </w:r>
-      <w:r>
-        <w:rPr>
-          <w:rtl w:val="0"/>
-        </w:rPr>
+        <w:t xml:space="preserve">Cloud Full Stack Developer / Solution Engineer, Oracle</w:t>
+      </w:r>
+      <w:r>
+        <w:rPr>
+          <w:rFonts w:ascii="Times New Roman" w:cs="Times New Roman" w:eastAsia="Times New Roman" w:hAnsi="Times New Roman"/>
+          <w:sz w:val="20"/>
+          <w:szCs w:val="20"/>
+          <w:rtl w:val="0"/>
+        </w:rPr>
+        <w:t xml:space="preserve">                                                                                July 2018 – January 2020</w:t>
       </w:r>
     </w:p>
     <w:p>
@@ -727,7 +722,7 @@
         <w:widowControl w:val="0"/>
         <w:numPr>
           <w:ilvl w:val="0"/>
-          <w:numId w:val="3"/>
+          <w:numId w:val="1"/>
         </w:numPr>
         <w:ind w:left="720" w:hanging="360"/>
         <w:rPr>
@@ -743,7 +738,7 @@
           <w:szCs w:val="20"/>
           <w:rtl w:val="0"/>
         </w:rPr>
-        <w:t xml:space="preserve">Built proof-of-concept (POC) apps to demonstrate how cloud offerings could be used in certain business use cases</w:t>
+        <w:t xml:space="preserve">Built proof-of-concept (MVP) apps to demonstrate how Oracle Cloud PaaS/IaaS could be used in certain business use cases</w:t>
       </w:r>
     </w:p>
     <w:p>
@@ -751,14 +746,13 @@
         <w:widowControl w:val="0"/>
         <w:numPr>
           <w:ilvl w:val="0"/>
-          <w:numId w:val="3"/>
+          <w:numId w:val="1"/>
         </w:numPr>
         <w:ind w:left="720" w:hanging="360"/>
         <w:rPr>
           <w:rFonts w:ascii="Times New Roman" w:cs="Times New Roman" w:eastAsia="Times New Roman" w:hAnsi="Times New Roman"/>
           <w:sz w:val="20"/>
           <w:szCs w:val="20"/>
-          <w:u w:val="none"/>
         </w:rPr>
       </w:pPr>
       <w:r>
@@ -790,16 +784,7 @@
           <w:szCs w:val="20"/>
           <w:rtl w:val="0"/>
         </w:rPr>
-        <w:t xml:space="preserve"> (using token auth, BCrypt hashes), and integrated it</w:t>
-      </w:r>
-      <w:r>
-        <w:rPr>
-          <w:rFonts w:ascii="Times New Roman" w:cs="Times New Roman" w:eastAsia="Times New Roman" w:hAnsi="Times New Roman"/>
-          <w:sz w:val="20"/>
-          <w:szCs w:val="20"/>
-          <w:rtl w:val="0"/>
-        </w:rPr>
-        <w:t xml:space="preserve"> with OCI Compute using Docker</w:t>
+        <w:t xml:space="preserve"> (using token auth, BCrypt hashes), and integrated it with OCI Compute using Docker</w:t>
       </w:r>
     </w:p>
     <w:p>
@@ -807,7 +792,7 @@
         <w:widowControl w:val="0"/>
         <w:numPr>
           <w:ilvl w:val="0"/>
-          <w:numId w:val="3"/>
+          <w:numId w:val="1"/>
         </w:numPr>
         <w:ind w:left="720" w:hanging="360"/>
         <w:rPr>
@@ -835,7 +820,7 @@
             <w:u w:val="single"/>
             <w:rtl w:val="0"/>
           </w:rPr>
-          <w:t xml:space="preserve">RN movie app</w:t>
+          <w:t xml:space="preserve">React Native movie app</w:t>
         </w:r>
       </w:hyperlink>
       <w:r>
@@ -867,7 +852,7 @@
           <w:szCs w:val="20"/>
           <w:rtl w:val="0"/>
         </w:rPr>
-        <w:t xml:space="preserve"> (Oracle Mobile Hub), </w:t>
+        <w:t xml:space="preserve"> (Mobile Hub), </w:t>
       </w:r>
       <w:hyperlink r:id="rId15">
         <w:r>
@@ -913,18 +898,13 @@
         </w:rPr>
         <w:t xml:space="preserve"> μ-services</w:t>
       </w:r>
-      <w:r>
-        <w:rPr>
-          <w:rtl w:val="0"/>
-        </w:rPr>
-      </w:r>
     </w:p>
     <w:p>
       <w:pPr>
         <w:widowControl w:val="0"/>
         <w:numPr>
           <w:ilvl w:val="0"/>
-          <w:numId w:val="1"/>
+          <w:numId w:val="3"/>
         </w:numPr>
         <w:ind w:left="720" w:hanging="360"/>
         <w:rPr>
@@ -964,25 +944,19 @@
         </w:rPr>
         <w:t xml:space="preserve"> that inserts numBytes of CLOBs</w:t>
       </w:r>
-      <w:r>
-        <w:rPr>
-          <w:rtl w:val="0"/>
-        </w:rPr>
-      </w:r>
     </w:p>
     <w:p>
       <w:pPr>
         <w:widowControl w:val="0"/>
         <w:numPr>
           <w:ilvl w:val="0"/>
-          <w:numId w:val="3"/>
+          <w:numId w:val="1"/>
         </w:numPr>
         <w:ind w:left="720" w:hanging="360"/>
         <w:rPr>
           <w:rFonts w:ascii="Times New Roman" w:cs="Times New Roman" w:eastAsia="Times New Roman" w:hAnsi="Times New Roman"/>
           <w:sz w:val="20"/>
           <w:szCs w:val="20"/>
-          <w:u w:val="none"/>
         </w:rPr>
       </w:pPr>
       <w:r>
@@ -1004,7 +978,7 @@
             <w:u w:val="single"/>
             <w:rtl w:val="0"/>
           </w:rPr>
-          <w:t xml:space="preserve">REST API</w:t>
+          <w:t xml:space="preserve">REST API in Golang</w:t>
         </w:r>
       </w:hyperlink>
       <w:r>
@@ -1014,7 +988,7 @@
           <w:szCs w:val="20"/>
           <w:rtl w:val="0"/>
         </w:rPr>
-        <w:t xml:space="preserve"> to integrate a digital assistant with OCI for a sales rep working with a burger chain</w:t>
+        <w:t xml:space="preserve"> to integrate a chatbot with OCI for a sales rep working with a burger chain</w:t>
       </w:r>
     </w:p>
     <w:p>
@@ -1022,14 +996,13 @@
         <w:widowControl w:val="0"/>
         <w:numPr>
           <w:ilvl w:val="0"/>
-          <w:numId w:val="3"/>
+          <w:numId w:val="1"/>
         </w:numPr>
         <w:ind w:left="720" w:hanging="360"/>
         <w:rPr>
           <w:rFonts w:ascii="Times New Roman" w:cs="Times New Roman" w:eastAsia="Times New Roman" w:hAnsi="Times New Roman"/>
           <w:sz w:val="20"/>
           <w:szCs w:val="20"/>
-          <w:u w:val="none"/>
         </w:rPr>
       </w:pPr>
       <w:r>
@@ -1069,7 +1042,7 @@
         <w:widowControl w:val="0"/>
         <w:numPr>
           <w:ilvl w:val="0"/>
-          <w:numId w:val="3"/>
+          <w:numId w:val="1"/>
         </w:numPr>
         <w:ind w:left="720" w:hanging="360"/>
         <w:rPr>
@@ -1085,7 +1058,7 @@
           <w:szCs w:val="20"/>
           <w:rtl w:val="0"/>
         </w:rPr>
-        <w:t xml:space="preserve">Demoed how to </w:t>
+        <w:t xml:space="preserve">Used Python to demo how to </w:t>
       </w:r>
       <w:hyperlink r:id="rId20">
         <w:r>
@@ -1107,7 +1080,7 @@
           <w:szCs w:val="20"/>
           <w:rtl w:val="0"/>
         </w:rPr>
-        <w:t xml:space="preserve"> through Oracle Streaming to object storage on intervals (for BI use cases)</w:t>
+        <w:t xml:space="preserve"> from Streaming API to object storage (for BI use cases)</w:t>
       </w:r>
       <w:r>
         <w:rPr>
@@ -1180,7 +1153,7 @@
           <w:szCs w:val="20"/>
           <w:rtl w:val="0"/>
         </w:rPr>
-        <w:t xml:space="preserve">                 Summer 2015, Summer 2016</w:t>
+        <w:t xml:space="preserve">                  Summer 2015, Summer 2016</w:t>
       </w:r>
       <w:r>
         <w:rPr>
@@ -1248,7 +1221,7 @@
         <w:widowControl w:val="0"/>
         <w:numPr>
           <w:ilvl w:val="0"/>
-          <w:numId w:val="3"/>
+          <w:numId w:val="4"/>
         </w:numPr>
         <w:pBdr>
           <w:top w:space="0" w:sz="0" w:val="nil"/>
@@ -1280,7 +1253,7 @@
         <w:widowControl w:val="0"/>
         <w:numPr>
           <w:ilvl w:val="0"/>
-          <w:numId w:val="3"/>
+          <w:numId w:val="4"/>
         </w:numPr>
         <w:pBdr>
           <w:top w:space="0" w:sz="0" w:val="nil"/>
@@ -1313,7 +1286,7 @@
         <w:widowControl w:val="0"/>
         <w:numPr>
           <w:ilvl w:val="0"/>
-          <w:numId w:val="3"/>
+          <w:numId w:val="4"/>
         </w:numPr>
         <w:pBdr>
           <w:top w:space="0" w:sz="0" w:val="nil"/>
@@ -1346,7 +1319,7 @@
         <w:widowControl w:val="0"/>
         <w:numPr>
           <w:ilvl w:val="0"/>
-          <w:numId w:val="3"/>
+          <w:numId w:val="4"/>
         </w:numPr>
         <w:pBdr>
           <w:top w:space="0" w:sz="0" w:val="nil"/>
@@ -1378,7 +1351,7 @@
         <w:widowControl w:val="0"/>
         <w:numPr>
           <w:ilvl w:val="1"/>
-          <w:numId w:val="3"/>
+          <w:numId w:val="4"/>
         </w:numPr>
         <w:pBdr>
           <w:top w:space="0" w:sz="0" w:val="nil"/>
@@ -1410,7 +1383,7 @@
         <w:widowControl w:val="0"/>
         <w:numPr>
           <w:ilvl w:val="0"/>
-          <w:numId w:val="3"/>
+          <w:numId w:val="4"/>
         </w:numPr>
         <w:ind w:left="720" w:hanging="360"/>
         <w:rPr>
@@ -1443,7 +1416,7 @@
         <w:widowControl w:val="0"/>
         <w:numPr>
           <w:ilvl w:val="0"/>
-          <w:numId w:val="3"/>
+          <w:numId w:val="4"/>
         </w:numPr>
         <w:pBdr>
           <w:top w:space="0" w:sz="0" w:val="nil"/>
@@ -1475,7 +1448,7 @@
         <w:widowControl w:val="0"/>
         <w:numPr>
           <w:ilvl w:val="0"/>
-          <w:numId w:val="3"/>
+          <w:numId w:val="4"/>
         </w:numPr>
         <w:pBdr>
           <w:top w:space="0" w:sz="0" w:val="nil"/>
@@ -1664,7 +1637,7 @@
         <w:widowControl w:val="0"/>
         <w:numPr>
           <w:ilvl w:val="0"/>
-          <w:numId w:val="3"/>
+          <w:numId w:val="4"/>
         </w:numPr>
         <w:pBdr>
           <w:top w:space="0" w:sz="0" w:val="nil"/>
@@ -1688,7 +1661,7 @@
           <w:szCs w:val="20"/>
           <w:rtl w:val="0"/>
         </w:rPr>
-        <w:t xml:space="preserve">Modular, extensible, easy-to-read, OO TypeScript chess game from scratch using ES6, TDD, bundled with Webpack.</w:t>
+        <w:t xml:space="preserve">Modular, extensible, easy-to-read, OO TypeScript chess game from scratch using ES6, TDD, bundled with Webpack</w:t>
       </w:r>
     </w:p>
     <w:p>
@@ -1696,7 +1669,7 @@
         <w:widowControl w:val="0"/>
         <w:numPr>
           <w:ilvl w:val="0"/>
-          <w:numId w:val="3"/>
+          <w:numId w:val="4"/>
         </w:numPr>
         <w:ind w:left="720" w:hanging="360"/>
         <w:rPr>
@@ -1712,7 +1685,7 @@
           <w:szCs w:val="20"/>
           <w:rtl w:val="0"/>
         </w:rPr>
-        <w:t xml:space="preserve">Documented with several test-cases per piece using ES6 TS with Mocha and Chai (`$ npm test`: 65+ passing, Travis CI).</w:t>
+        <w:t xml:space="preserve">Documented with several test-cases per piece using ES6 TS with Mocha and Chai (`$ npm test`: 65+ passing, Travis CI)</w:t>
       </w:r>
     </w:p>
     <w:p>
@@ -1777,7 +1750,6 @@
       <w:r>
         <w:rPr>
           <w:rFonts w:ascii="Times New Roman" w:cs="Times New Roman" w:eastAsia="Times New Roman" w:hAnsi="Times New Roman"/>
-          <w:b w:val="1"/>
           <w:sz w:val="20"/>
           <w:szCs w:val="20"/>
           <w:rtl w:val="0"/>
@@ -1793,7 +1765,7 @@
         </w:rPr>
         <w:t xml:space="preserve">     </w:t>
         <w:tab/>
-        <w:t xml:space="preserve">                                                  January 2019</w:t>
+        <w:t xml:space="preserve">                                                                2019</w:t>
       </w:r>
     </w:p>
     <w:p>
@@ -1801,7 +1773,7 @@
         <w:widowControl w:val="0"/>
         <w:numPr>
           <w:ilvl w:val="0"/>
-          <w:numId w:val="3"/>
+          <w:numId w:val="4"/>
         </w:numPr>
         <w:ind w:left="720" w:hanging="360"/>
         <w:rPr>
@@ -1817,7 +1789,42 @@
           <w:szCs w:val="20"/>
           <w:rtl w:val="0"/>
         </w:rPr>
-        <w:t xml:space="preserve">Implemented + tested server-side API in ES7 Express, JWT Bearer Tokens and Basic Authentication, Back-end in Postgres</w:t>
+        <w:t xml:space="preserve">Implemented API in ES7 Express, JWT Bearer Tokens and Basic Authentication, Back-end in Postgres, React on front-end.</w:t>
+      </w:r>
+    </w:p>
+    <w:p>
+      <w:pPr>
+        <w:widowControl w:val="0"/>
+        <w:rPr>
+          <w:rFonts w:ascii="Times New Roman" w:cs="Times New Roman" w:eastAsia="Times New Roman" w:hAnsi="Times New Roman"/>
+          <w:sz w:val="20"/>
+          <w:szCs w:val="20"/>
+        </w:rPr>
+      </w:pPr>
+      <w:hyperlink r:id="rId25">
+        <w:r>
+          <w:rPr>
+            <w:rFonts w:ascii="Times New Roman" w:cs="Times New Roman" w:eastAsia="Times New Roman" w:hAnsi="Times New Roman"/>
+            <w:b w:val="1"/>
+            <w:color w:val="1155cc"/>
+            <w:sz w:val="20"/>
+            <w:szCs w:val="20"/>
+            <w:u w:val="single"/>
+            <w:rtl w:val="0"/>
+          </w:rPr>
+          <w:t xml:space="preserve">Trending News Dashboard</w:t>
+        </w:r>
+      </w:hyperlink>
+      <w:r>
+        <w:rPr>
+          <w:rFonts w:ascii="Times New Roman" w:cs="Times New Roman" w:eastAsia="Times New Roman" w:hAnsi="Times New Roman"/>
+          <w:sz w:val="20"/>
+          <w:szCs w:val="20"/>
+          <w:rtl w:val="0"/>
+        </w:rPr>
+        <w:t xml:space="preserve">    </w:t>
+        <w:tab/>
+        <w:t xml:space="preserve">                                                                                                                                                      2020</w:t>
       </w:r>
     </w:p>
     <w:p>
@@ -1825,7 +1832,7 @@
         <w:widowControl w:val="0"/>
         <w:numPr>
           <w:ilvl w:val="0"/>
-          <w:numId w:val="3"/>
+          <w:numId w:val="4"/>
         </w:numPr>
         <w:ind w:left="720" w:hanging="360"/>
         <w:rPr>
@@ -1841,32 +1848,7 @@
           <w:szCs w:val="20"/>
           <w:rtl w:val="0"/>
         </w:rPr>
-        <w:t xml:space="preserve">Coded a front-end in React, private routes with React Router, sha256 hash password before sending (with nginx + TLS)</w:t>
-      </w:r>
-    </w:p>
-    <w:p>
-      <w:pPr>
-        <w:widowControl w:val="0"/>
-        <w:numPr>
-          <w:ilvl w:val="0"/>
-          <w:numId w:val="3"/>
-        </w:numPr>
-        <w:ind w:left="720" w:hanging="360"/>
-        <w:rPr>
-          <w:rFonts w:ascii="Times New Roman" w:cs="Times New Roman" w:eastAsia="Times New Roman" w:hAnsi="Times New Roman"/>
-          <w:sz w:val="20"/>
-          <w:szCs w:val="20"/>
-          <w:u w:val="none"/>
-        </w:rPr>
-      </w:pPr>
-      <w:r>
-        <w:rPr>
-          <w:rFonts w:ascii="Times New Roman" w:cs="Times New Roman" w:eastAsia="Times New Roman" w:hAnsi="Times New Roman"/>
-          <w:sz w:val="20"/>
-          <w:szCs w:val="20"/>
-          <w:rtl w:val="0"/>
-        </w:rPr>
-        <w:t xml:space="preserve">Created secure upload functionality by ensuring valid file type during streaming, limited file size, enabled video-streaming</w:t>
+        <w:t xml:space="preserve">Built a dashboard using a news API with Vanilla ES6 JavaScript, HTML, and CSS {testing: { unit: jest, e2e: cypress } }. </w:t>
       </w:r>
     </w:p>
     <w:p>
@@ -1906,7 +1888,7 @@
         <w:t xml:space="preserve">Pull Requests</w:t>
         <w:tab/>
       </w:r>
-      <w:hyperlink r:id="rId25">
+      <w:hyperlink r:id="rId26">
         <w:r>
           <w:rPr>
             <w:rFonts w:ascii="Times New Roman" w:cs="Times New Roman" w:eastAsia="Times New Roman" w:hAnsi="Times New Roman"/>
@@ -1937,7 +1919,7 @@
         </w:rPr>
         <w:t xml:space="preserve"> </w:t>
       </w:r>
-      <w:hyperlink r:id="rId26">
+      <w:hyperlink r:id="rId27">
         <w:r>
           <w:rPr>
             <w:rFonts w:ascii="Times New Roman" w:cs="Times New Roman" w:eastAsia="Times New Roman" w:hAnsi="Times New Roman"/>
@@ -1968,7 +1950,7 @@
         </w:rPr>
         <w:t xml:space="preserve"> </w:t>
       </w:r>
-      <w:hyperlink r:id="rId27">
+      <w:hyperlink r:id="rId28">
         <w:r>
           <w:rPr>
             <w:rFonts w:ascii="Times New Roman" w:cs="Times New Roman" w:eastAsia="Times New Roman" w:hAnsi="Times New Roman"/>
@@ -1990,7 +1972,7 @@
         </w:rPr>
         <w:t xml:space="preserve"> – update </w:t>
       </w:r>
-      <w:hyperlink r:id="rId28">
+      <w:hyperlink r:id="rId29">
         <w:r>
           <w:rPr>
             <w:rFonts w:ascii="Times New Roman" w:cs="Times New Roman" w:eastAsia="Times New Roman" w:hAnsi="Times New Roman"/>
@@ -2128,7 +2110,7 @@
                 <w:szCs w:val="20"/>
               </w:rPr>
             </w:pPr>
-            <w:hyperlink r:id="rId29">
+            <w:hyperlink r:id="rId30">
               <w:r>
                 <w:rPr>
                   <w:rFonts w:ascii="Times New Roman" w:cs="Times New Roman" w:eastAsia="Times New Roman" w:hAnsi="Times New Roman"/>
@@ -2150,7 +2132,7 @@
                             <pic:cNvPicPr preferRelativeResize="0"/>
                           </pic:nvPicPr>
                           <pic:blipFill>
-                            <a:blip r:embed="rId30"/>
+                            <a:blip r:embed="rId31"/>
                             <a:srcRect b="0" l="0" r="0" t="0"/>
                             <a:stretch>
                               <a:fillRect/>
@@ -2190,7 +2172,7 @@
                 <w:szCs w:val="20"/>
               </w:rPr>
             </w:pPr>
-            <w:hyperlink r:id="rId31">
+            <w:hyperlink r:id="rId32">
               <w:r>
                 <w:rPr>
                   <w:rFonts w:ascii="Times New Roman" w:cs="Times New Roman" w:eastAsia="Times New Roman" w:hAnsi="Times New Roman"/>
@@ -2211,7 +2193,7 @@
                             <pic:cNvPicPr preferRelativeResize="0"/>
                           </pic:nvPicPr>
                           <pic:blipFill>
-                            <a:blip r:embed="rId32"/>
+                            <a:blip r:embed="rId33"/>
                             <a:srcRect b="0" l="0" r="0" t="0"/>
                             <a:stretch>
                               <a:fillRect/>
@@ -2716,6 +2698,116 @@
       </w:rPr>
     </w:lvl>
   </w:abstractNum>
+  <w:abstractNum w:abstractNumId="4">
+    <w:lvl w:ilvl="0">
+      <w:start w:val="1"/>
+      <w:numFmt w:val="bullet"/>
+      <w:lvlText w:val="●"/>
+      <w:lvlJc w:val="left"/>
+      <w:pPr>
+        <w:ind w:left="720" w:hanging="360"/>
+      </w:pPr>
+      <w:rPr>
+        <w:u w:val="none"/>
+      </w:rPr>
+    </w:lvl>
+    <w:lvl w:ilvl="1">
+      <w:start w:val="1"/>
+      <w:numFmt w:val="bullet"/>
+      <w:lvlText w:val="○"/>
+      <w:lvlJc w:val="left"/>
+      <w:pPr>
+        <w:ind w:left="1440" w:hanging="360"/>
+      </w:pPr>
+      <w:rPr>
+        <w:u w:val="none"/>
+      </w:rPr>
+    </w:lvl>
+    <w:lvl w:ilvl="2">
+      <w:start w:val="1"/>
+      <w:numFmt w:val="bullet"/>
+      <w:lvlText w:val="■"/>
+      <w:lvlJc w:val="left"/>
+      <w:pPr>
+        <w:ind w:left="2160" w:hanging="360"/>
+      </w:pPr>
+      <w:rPr>
+        <w:u w:val="none"/>
+      </w:rPr>
+    </w:lvl>
+    <w:lvl w:ilvl="3">
+      <w:start w:val="1"/>
+      <w:numFmt w:val="bullet"/>
+      <w:lvlText w:val="●"/>
+      <w:lvlJc w:val="left"/>
+      <w:pPr>
+        <w:ind w:left="2880" w:hanging="360"/>
+      </w:pPr>
+      <w:rPr>
+        <w:u w:val="none"/>
+      </w:rPr>
+    </w:lvl>
+    <w:lvl w:ilvl="4">
+      <w:start w:val="1"/>
+      <w:numFmt w:val="bullet"/>
+      <w:lvlText w:val="○"/>
+      <w:lvlJc w:val="left"/>
+      <w:pPr>
+        <w:ind w:left="3600" w:hanging="360"/>
+      </w:pPr>
+      <w:rPr>
+        <w:u w:val="none"/>
+      </w:rPr>
+    </w:lvl>
+    <w:lvl w:ilvl="5">
+      <w:start w:val="1"/>
+      <w:numFmt w:val="bullet"/>
+      <w:lvlText w:val="■"/>
+      <w:lvlJc w:val="left"/>
+      <w:pPr>
+        <w:ind w:left="4320" w:hanging="360"/>
+      </w:pPr>
+      <w:rPr>
+        <w:u w:val="none"/>
+      </w:rPr>
+    </w:lvl>
+    <w:lvl w:ilvl="6">
+      <w:start w:val="1"/>
+      <w:numFmt w:val="bullet"/>
+      <w:lvlText w:val="●"/>
+      <w:lvlJc w:val="left"/>
+      <w:pPr>
+        <w:ind w:left="5040" w:hanging="360"/>
+      </w:pPr>
+      <w:rPr>
+        <w:u w:val="none"/>
+      </w:rPr>
+    </w:lvl>
+    <w:lvl w:ilvl="7">
+      <w:start w:val="1"/>
+      <w:numFmt w:val="bullet"/>
+      <w:lvlText w:val="○"/>
+      <w:lvlJc w:val="left"/>
+      <w:pPr>
+        <w:ind w:left="5760" w:hanging="360"/>
+      </w:pPr>
+      <w:rPr>
+        <w:u w:val="none"/>
+      </w:rPr>
+    </w:lvl>
+    <w:lvl w:ilvl="8">
+      <w:start w:val="1"/>
+      <w:numFmt w:val="bullet"/>
+      <w:lvlText w:val="■"/>
+      <w:lvlJc w:val="left"/>
+      <w:pPr>
+        <w:ind w:left="6480" w:hanging="360"/>
+      </w:pPr>
+      <w:rPr>
+        <w:u w:val="none"/>
+      </w:rPr>
+    </w:lvl>
+  </w:abstractNum>
   <w:num w:numId="1">
     <w:abstractNumId w:val="1"/>
   </w:num>
@@ -2724,6 +2816,9 @@
   </w:num>
   <w:num w:numId="3">
     <w:abstractNumId w:val="3"/>
+  </w:num>
+  <w:num w:numId="4">
+    <w:abstractNumId w:val="4"/>
   </w:num>
 </w:numbering>
 </file>

</xml_diff>